<commit_message>
Actualizar portada al formato del curso y simplificar la redacción
Portada con el formato de la materia (Matemáticas Discretas, Módulo 4:
Álgebra Booleana, datos del alumno y profesora, fecha 2 de agosto).
Redacción del cuerpo en un estilo más directo: sin guiones largos y con
vocabulario más sencillo. Filas de tablas sin cortes a media fila.

Co-Authored-By: Claude Fable 5 <noreply@anthropic.com>
Claude-Session: https://claude.ai/code/session_015UF77vNc2anNhC4cbLjXz9
</commit_message>
<xml_diff>
--- a/tarea-4-compuertas-logicas/Tarea4_Circuitos_con_compuertas_logicas.docx
+++ b/tarea-4-compuertas-logicas/Tarea4_Circuitos_con_compuertas_logicas.docx
@@ -4,7 +4,7 @@
   <w:body>
     <w:p>
       <w:pPr>
-        <w:spacing w:after="120" w:before="1600"/>
+        <w:spacing w:after="700" w:before="2600"/>
         <w:jc w:val="center"/>
       </w:pPr>
       <w:r>
@@ -12,15 +12,67 @@
           <w:rFonts w:ascii="Arial" w:cs="Arial" w:eastAsia="Arial" w:hAnsi="Arial"/>
           <w:b/>
           <w:bCs/>
-          <w:sz w:val="36"/>
-          <w:szCs w:val="36"/>
-        </w:rPr>
-        <w:t xml:space="preserve">UNIVERSIDAD ANÁHUAC</w:t>
-      </w:r>
-    </w:p>
-    <w:p>
-      <w:pPr>
-        <w:spacing w:after="1200" w:before="0"/>
+          <w:color w:val="5C3A1E"/>
+          <w:sz w:val="28"/>
+          <w:szCs w:val="28"/>
+        </w:rPr>
+        <w:t xml:space="preserve">Online</w:t>
+      </w:r>
+    </w:p>
+    <w:p>
+      <w:pPr>
+        <w:spacing w:after="220" w:before="0"/>
+        <w:jc w:val="center"/>
+      </w:pPr>
+      <w:r>
+        <w:rPr>
+          <w:rFonts w:ascii="Arial" w:cs="Arial" w:eastAsia="Arial" w:hAnsi="Arial"/>
+          <w:b/>
+          <w:bCs/>
+          <w:color w:val="C4841D"/>
+          <w:sz w:val="40"/>
+          <w:szCs w:val="40"/>
+        </w:rPr>
+        <w:t xml:space="preserve">Matemáticas Discretas</w:t>
+      </w:r>
+    </w:p>
+    <w:p>
+      <w:pPr>
+        <w:spacing w:after="900" w:before="0"/>
+        <w:jc w:val="center"/>
+      </w:pPr>
+      <w:r>
+        <w:rPr>
+          <w:rFonts w:ascii="Arial" w:cs="Arial" w:eastAsia="Arial" w:hAnsi="Arial"/>
+          <w:b/>
+          <w:bCs/>
+          <w:color w:val="000000"/>
+          <w:sz w:val="28"/>
+          <w:szCs w:val="28"/>
+        </w:rPr>
+        <w:t xml:space="preserve">Ing. en Sistemas Computacionales</w:t>
+      </w:r>
+    </w:p>
+    <w:p>
+      <w:pPr>
+        <w:spacing w:after="220" w:before="0"/>
+        <w:jc w:val="center"/>
+      </w:pPr>
+      <w:r>
+        <w:rPr>
+          <w:rFonts w:ascii="Arial" w:cs="Arial" w:eastAsia="Arial" w:hAnsi="Arial"/>
+          <w:b/>
+          <w:bCs/>
+          <w:color w:val="C4841D"/>
+          <w:sz w:val="30"/>
+          <w:szCs w:val="30"/>
+        </w:rPr>
+        <w:t xml:space="preserve">José Manuel Rodríguez Cantú</w:t>
+      </w:r>
+    </w:p>
+    <w:p>
+      <w:pPr>
+        <w:spacing w:after="900" w:before="0"/>
         <w:jc w:val="center"/>
       </w:pPr>
       <w:r>
@@ -28,134 +80,68 @@
           <w:rFonts w:ascii="Arial" w:cs="Arial" w:eastAsia="Arial" w:hAnsi="Arial"/>
           <w:b w:val="false"/>
           <w:bCs w:val="false"/>
+          <w:color w:val="404040"/>
           <w:sz w:val="26"/>
           <w:szCs w:val="26"/>
         </w:rPr>
-        <w:t xml:space="preserve">[Escuela o Facultad]</w:t>
+        <w:t xml:space="preserve">00612676</w:t>
+      </w:r>
+    </w:p>
+    <w:p>
+      <w:pPr>
+        <w:spacing w:after="220" w:before="0"/>
+        <w:jc w:val="center"/>
+      </w:pPr>
+      <w:r>
+        <w:rPr>
+          <w:rFonts w:ascii="Arial" w:cs="Arial" w:eastAsia="Arial" w:hAnsi="Arial"/>
+          <w:b/>
+          <w:bCs/>
+          <w:color w:val="C4841D"/>
+          <w:sz w:val="32"/>
+          <w:szCs w:val="32"/>
+        </w:rPr>
+        <w:t xml:space="preserve">Tarea 4: Circuitos con compuertas lógicas y su aplicación</w:t>
+      </w:r>
+    </w:p>
+    <w:p>
+      <w:pPr>
+        <w:spacing w:after="900" w:before="0"/>
+        <w:jc w:val="center"/>
+      </w:pPr>
+      <w:r>
+        <w:rPr>
+          <w:rFonts w:ascii="Arial" w:cs="Arial" w:eastAsia="Arial" w:hAnsi="Arial"/>
+          <w:b/>
+          <w:bCs/>
+          <w:color w:val="000000"/>
+          <w:sz w:val="28"/>
+          <w:szCs w:val="28"/>
+        </w:rPr>
+        <w:t xml:space="preserve">Módulo 4: Álgebra Booleana</w:t>
+      </w:r>
+    </w:p>
+    <w:p>
+      <w:pPr>
+        <w:spacing w:after="900" w:before="0"/>
+        <w:jc w:val="center"/>
+      </w:pPr>
+      <w:r>
+        <w:rPr>
+          <w:rFonts w:ascii="Arial" w:cs="Arial" w:eastAsia="Arial" w:hAnsi="Arial"/>
+          <w:b/>
+          <w:bCs/>
+          <w:color w:val="C4841D"/>
+          <w:sz w:val="28"/>
+          <w:szCs w:val="28"/>
+        </w:rPr>
+        <w:t xml:space="preserve">Ana Laura Merino Díaz</w:t>
       </w:r>
     </w:p>
     <w:p>
       <w:pPr>
         <w:spacing w:after="120" w:before="0"/>
         <w:jc w:val="center"/>
-      </w:pPr>
-      <w:r>
-        <w:rPr>
-          <w:rFonts w:ascii="Arial" w:cs="Arial" w:eastAsia="Arial" w:hAnsi="Arial"/>
-          <w:b/>
-          <w:bCs/>
-          <w:sz w:val="30"/>
-          <w:szCs w:val="30"/>
-        </w:rPr>
-        <w:t xml:space="preserve">Tarea 4</w:t>
-      </w:r>
-    </w:p>
-    <w:p>
-      <w:pPr>
-        <w:spacing w:after="1200" w:before="0"/>
-        <w:jc w:val="center"/>
-      </w:pPr>
-      <w:r>
-        <w:rPr>
-          <w:rFonts w:ascii="Arial" w:cs="Arial" w:eastAsia="Arial" w:hAnsi="Arial"/>
-          <w:b/>
-          <w:bCs/>
-          <w:sz w:val="32"/>
-          <w:szCs w:val="32"/>
-        </w:rPr>
-        <w:t xml:space="preserve">Circuitos con compuertas lógicas y su aplicación</w:t>
-      </w:r>
-    </w:p>
-    <w:p>
-      <w:pPr>
-        <w:spacing w:after="200" w:before="0"/>
-        <w:jc w:val="center"/>
-      </w:pPr>
-      <w:r>
-        <w:rPr>
-          <w:rFonts w:ascii="Arial" w:cs="Arial" w:eastAsia="Arial" w:hAnsi="Arial"/>
-          <w:b w:val="false"/>
-          <w:bCs w:val="false"/>
-          <w:sz w:val="24"/>
-          <w:szCs w:val="24"/>
-        </w:rPr>
-        <w:t xml:space="preserve">Materia: [Nombre de la materia]</w:t>
-      </w:r>
-    </w:p>
-    <w:p>
-      <w:pPr>
-        <w:spacing w:after="200" w:before="0"/>
-        <w:jc w:val="center"/>
-      </w:pPr>
-      <w:r>
-        <w:rPr>
-          <w:rFonts w:ascii="Arial" w:cs="Arial" w:eastAsia="Arial" w:hAnsi="Arial"/>
-          <w:b w:val="false"/>
-          <w:bCs w:val="false"/>
-          <w:sz w:val="24"/>
-          <w:szCs w:val="24"/>
-        </w:rPr>
-        <w:t xml:space="preserve">Alumno(a): [Nombre completo del alumno]</w:t>
-      </w:r>
-    </w:p>
-    <w:p>
-      <w:pPr>
-        <w:spacing w:after="200" w:before="0"/>
-        <w:jc w:val="center"/>
-      </w:pPr>
-      <w:r>
-        <w:rPr>
-          <w:rFonts w:ascii="Arial" w:cs="Arial" w:eastAsia="Arial" w:hAnsi="Arial"/>
-          <w:b w:val="false"/>
-          <w:bCs w:val="false"/>
-          <w:sz w:val="24"/>
-          <w:szCs w:val="24"/>
-        </w:rPr>
-        <w:t xml:space="preserve">Matrícula: [Matrícula]</w:t>
-      </w:r>
-    </w:p>
-    <w:p>
-      <w:pPr>
-        <w:spacing w:after="200" w:before="0"/>
-        <w:jc w:val="center"/>
-      </w:pPr>
-      <w:r>
-        <w:rPr>
-          <w:rFonts w:ascii="Arial" w:cs="Arial" w:eastAsia="Arial" w:hAnsi="Arial"/>
-          <w:b w:val="false"/>
-          <w:bCs w:val="false"/>
-          <w:sz w:val="24"/>
-          <w:szCs w:val="24"/>
-        </w:rPr>
-        <w:t xml:space="preserve">Profesor(a): [Nombre del profesor]</w:t>
-      </w:r>
-    </w:p>
-    <w:p>
-      <w:pPr>
-        <w:spacing w:after="0" w:before="0"/>
-        <w:jc w:val="center"/>
-      </w:pPr>
-      <w:r>
-        <w:rPr>
-          <w:rFonts w:ascii="Arial" w:cs="Arial" w:eastAsia="Arial" w:hAnsi="Arial"/>
-          <w:b w:val="false"/>
-          <w:bCs w:val="false"/>
-          <w:sz w:val="24"/>
-          <w:szCs w:val="24"/>
-        </w:rPr>
-        <w:t xml:space="preserve">Fecha de entrega: 2 de agosto de 2026</w:t>
-      </w:r>
-    </w:p>
-    <w:p>
-      <w:r>
-        <w:br w:type="page"/>
-      </w:r>
-    </w:p>
-    <w:p>
-      <w:pPr>
-        <w:pStyle w:val="Heading1"/>
-        <w:keepNext/>
-        <w:spacing w:after="120" w:before="240"/>
       </w:pPr>
       <w:r>
         <w:rPr>
@@ -166,6 +152,46 @@
           <w:sz w:val="26"/>
           <w:szCs w:val="26"/>
         </w:rPr>
+        <w:t xml:space="preserve">Fecha:</w:t>
+      </w:r>
+    </w:p>
+    <w:p>
+      <w:pPr>
+        <w:spacing w:after="0" w:before="0"/>
+        <w:jc w:val="center"/>
+      </w:pPr>
+      <w:r>
+        <w:rPr>
+          <w:rFonts w:ascii="Arial" w:cs="Arial" w:eastAsia="Arial" w:hAnsi="Arial"/>
+          <w:b w:val="false"/>
+          <w:bCs w:val="false"/>
+          <w:color w:val="000000"/>
+          <w:sz w:val="26"/>
+          <w:szCs w:val="26"/>
+        </w:rPr>
+        <w:t xml:space="preserve">2 de agosto de 2026</w:t>
+      </w:r>
+    </w:p>
+    <w:p>
+      <w:r>
+        <w:br w:type="page"/>
+      </w:r>
+    </w:p>
+    <w:p>
+      <w:pPr>
+        <w:pStyle w:val="Heading1"/>
+        <w:keepNext/>
+        <w:spacing w:after="120" w:before="240"/>
+      </w:pPr>
+      <w:r>
+        <w:rPr>
+          <w:rFonts w:ascii="Arial" w:cs="Arial" w:eastAsia="Arial" w:hAnsi="Arial"/>
+          <w:b/>
+          <w:bCs/>
+          <w:color w:val="000000"/>
+          <w:sz w:val="26"/>
+          <w:szCs w:val="26"/>
+        </w:rPr>
         <w:t xml:space="preserve">1. Introducción</w:t>
       </w:r>
     </w:p>
@@ -180,7 +206,7 @@
           <w:sz w:val="24"/>
           <w:szCs w:val="24"/>
         </w:rPr>
-        <w:t xml:space="preserve">Las compuertas lógicas son los bloques fundamentales de los sistemas digitales: dispositivos que reciben una o más señales binarias y producen una salida que depende de una operación del álgebra de Boole. A partir de su combinación es posible construir circuitos que resuelven problemas reales de control y automatización, desde una alarma doméstica hasta el procesador de una computadora.</w:t>
+        <w:t xml:space="preserve">Las compuertas lógicas son los bloques básicos de los sistemas digitales. Son dispositivos que reciben una o más señales binarias y entregan una salida que depende de una operación del álgebra de Boole. Al combinarlas se pueden construir circuitos que resuelven problemas reales de control y automatización, desde una alarma de casa hasta el procesador de una computadora.</w:t>
       </w:r>
     </w:p>
     <w:p>
@@ -194,7 +220,7 @@
           <w:sz w:val="24"/>
           <w:szCs w:val="24"/>
         </w:rPr>
-        <w:t xml:space="preserve">En el módulo anterior se elaboró la tabla de verdad de un problema de aplicación; en este reporte, elaborado con base en las lecturas elementales del curso y en fuentes externas de consulta, se retoma ese mismo problema para llevarlo hasta el diseño del circuito y su comprobación por software: una puerta electrónica para una granja que solo debe abrirse ante combinaciones específicas de tres botones (A, B y C). Para ello se describen primero las compuertas lógicas básicas, después se analiza el problema y se obtiene su función booleana a partir de la tabla de verdad, se simplifica dicha función, se diseña el circuito correspondiente y, por último, se comprueban los resultados con MATLAB.</w:t>
+        <w:t xml:space="preserve">En el módulo anterior se elaboró la tabla de verdad de un problema de aplicación. En este reporte, que toma como base las lecturas del curso y algunas fuentes externas, se retoma ese mismo problema para llegar hasta el diseño del circuito y su comprobación por software: una puerta electrónica para una granja que solo debe abrirse con ciertas combinaciones de tres botones (A, B y C). Primero se describen las compuertas lógicas básicas, después se analiza el problema y se obtiene la función booleana a partir de la tabla de verdad, luego se simplifica la función y se diseña el circuito, y al final se comprueban los resultados con MATLAB.</w:t>
       </w:r>
     </w:p>
     <w:p>
@@ -417,6 +443,9 @@
         </w:tc>
       </w:tr>
       <w:tr>
+        <w:trPr>
+          <w:cantSplit/>
+        </w:trPr>
         <w:tc>
           <w:tcPr>
             <w:tcW w:type="dxa" w:w="1250"/>
@@ -567,7 +596,7 @@
                 <w:sz w:val="20"/>
                 <w:szCs w:val="20"/>
               </w:rPr>
-              <w:t xml:space="preserve">Tiene una sola entrada. Invierte el valor lógico: la salida es 1 únicamente cuando la entrada es 0, y viceversa.</w:t>
+              <w:t xml:space="preserve">Tiene una sola entrada. Invierte el valor de la entrada: si recibe 0 entrega 1, y si recibe 1 entrega 0.</w:t>
             </w:r>
           </w:p>
         </w:tc>
@@ -599,6 +628,9 @@
         </w:tc>
       </w:tr>
       <w:tr>
+        <w:trPr>
+          <w:cantSplit/>
+        </w:trPr>
         <w:tc>
           <w:tcPr>
             <w:tcW w:type="dxa" w:w="1250"/>
@@ -765,6 +797,9 @@
         </w:tc>
       </w:tr>
       <w:tr>
+        <w:trPr>
+          <w:cantSplit/>
+        </w:trPr>
         <w:tc>
           <w:tcPr>
             <w:tcW w:type="dxa" w:w="1250"/>
@@ -931,6 +966,9 @@
         </w:tc>
       </w:tr>
       <w:tr>
+        <w:trPr>
+          <w:cantSplit/>
+        </w:trPr>
         <w:tc>
           <w:tcPr>
             <w:tcW w:type="dxa" w:w="1250"/>
@@ -1097,6 +1135,9 @@
         </w:tc>
       </w:tr>
       <w:tr>
+        <w:trPr>
+          <w:cantSplit/>
+        </w:trPr>
         <w:tc>
           <w:tcPr>
             <w:tcW w:type="dxa" w:w="1250"/>
@@ -1263,6 +1304,9 @@
         </w:tc>
       </w:tr>
       <w:tr>
+        <w:trPr>
+          <w:cantSplit/>
+        </w:trPr>
         <w:tc>
           <w:tcPr>
             <w:tcW w:type="dxa" w:w="1250"/>
@@ -1429,6 +1473,9 @@
         </w:tc>
       </w:tr>
       <w:tr>
+        <w:trPr>
+          <w:cantSplit/>
+        </w:trPr>
         <w:tc>
           <w:tcPr>
             <w:tcW w:type="dxa" w:w="1250"/>
@@ -1638,7 +1685,7 @@
           <w:sz w:val="24"/>
           <w:szCs w:val="24"/>
         </w:rPr>
-        <w:t xml:space="preserve">Las condiciones de apertura establecidas son dos: 1) que se pulse únicamente C, con A y B en reposo (A = 0, B = 0, C = 1); y 2) que se pulsen los tres botones a la vez (A = 1, B = 1, C = 1). En cualquier otra de las ocho combinaciones posibles la puerta debe permanecer cerrada, lo que aporta seguridad: quien no conozca la clave difícilmente acertará una de las dos combinaciones válidas.</w:t>
+        <w:t xml:space="preserve">Las condiciones de apertura son dos: 1) que se pulse únicamente C, con A y B en reposo (A = 0, B = 0, C = 1); y 2) que se pulsen los tres botones a la vez (A = 1, B = 1, C = 1). En cualquier otra de las ocho combinaciones posibles la puerta debe permanecer cerrada. Esto da seguridad, porque es difícil que alguien que no conozca la clave atine a una de las dos combinaciones válidas.</w:t>
       </w:r>
     </w:p>
     <w:p>
@@ -1694,6 +1741,7 @@
       </w:tblGrid>
       <w:tr>
         <w:trPr>
+          <w:cantSplit/>
           <w:tblHeader/>
         </w:trPr>
         <w:tc>
@@ -1843,6 +1891,9 @@
         </w:tc>
       </w:tr>
       <w:tr>
+        <w:trPr>
+          <w:cantSplit/>
+        </w:trPr>
         <w:tc>
           <w:tcPr>
             <w:tcW w:type="dxa" w:w="700"/>
@@ -1985,6 +2036,9 @@
         </w:tc>
       </w:tr>
       <w:tr>
+        <w:trPr>
+          <w:cantSplit/>
+        </w:trPr>
         <w:tc>
           <w:tcPr>
             <w:tcW w:type="dxa" w:w="700"/>
@@ -2128,6 +2182,9 @@
         </w:tc>
       </w:tr>
       <w:tr>
+        <w:trPr>
+          <w:cantSplit/>
+        </w:trPr>
         <w:tc>
           <w:tcPr>
             <w:tcW w:type="dxa" w:w="700"/>
@@ -2270,6 +2327,9 @@
         </w:tc>
       </w:tr>
       <w:tr>
+        <w:trPr>
+          <w:cantSplit/>
+        </w:trPr>
         <w:tc>
           <w:tcPr>
             <w:tcW w:type="dxa" w:w="700"/>
@@ -2412,6 +2472,9 @@
         </w:tc>
       </w:tr>
       <w:tr>
+        <w:trPr>
+          <w:cantSplit/>
+        </w:trPr>
         <w:tc>
           <w:tcPr>
             <w:tcW w:type="dxa" w:w="700"/>
@@ -2554,6 +2617,9 @@
         </w:tc>
       </w:tr>
       <w:tr>
+        <w:trPr>
+          <w:cantSplit/>
+        </w:trPr>
         <w:tc>
           <w:tcPr>
             <w:tcW w:type="dxa" w:w="700"/>
@@ -2696,6 +2762,9 @@
         </w:tc>
       </w:tr>
       <w:tr>
+        <w:trPr>
+          <w:cantSplit/>
+        </w:trPr>
         <w:tc>
           <w:tcPr>
             <w:tcW w:type="dxa" w:w="700"/>
@@ -2838,6 +2907,9 @@
         </w:tc>
       </w:tr>
       <w:tr>
+        <w:trPr>
+          <w:cantSplit/>
+        </w:trPr>
         <w:tc>
           <w:tcPr>
             <w:tcW w:type="dxa" w:w="700"/>
@@ -3100,7 +3172,7 @@
           <w:sz w:val="24"/>
           <w:szCs w:val="24"/>
         </w:rPr>
-        <w:t xml:space="preserve">El mapa de Karnaugh de la Tabla 3 confirma el resultado: los minitérminos m₁ y m₇ no son celdas adyacentes (difieren en dos variables), así que no pueden agruparse entre sí y la reducción se obtiene por factorización algebraica. La simplificación es significativa: la forma canónica requiere dos inversores, dos compuertas AND de tres entradas y una OR (cinco compuertas), mientras que la forma simplificada solo necesita una XNOR y una AND (dos compuertas).</w:t>
+        <w:t xml:space="preserve">El mapa de Karnaugh de la Tabla 3 confirma el resultado: los minitérminos m₁ y m₇ no son celdas adyacentes (difieren en dos variables), así que no pueden agruparse entre sí y la reducción se obtiene por factorización. El ahorro es claro: la forma canónica requiere dos inversores, dos compuertas AND de tres entradas y una OR (cinco compuertas), mientras que la forma simplificada solo necesita una XNOR y una AND (dos compuertas).</w:t>
       </w:r>
     </w:p>
     <w:p>
@@ -4482,7 +4554,7 @@
           <w:sz w:val="24"/>
           <w:szCs w:val="24"/>
         </w:rPr>
-        <w:t xml:space="preserve">El resultado obtenido tiene una lectura física clara: la puerta de la granja se abre únicamente en 2 de las 8 combinaciones posibles. El botón C cumple la función de confirmación —sin él la puerta jamás se abre—, mientras que los botones A y B deben encontrarse en el mismo estado, ya sea ambos en reposo (condición 1) o ambos pulsados (condición 2). Cualquier intento de apertura pulsando solo A, solo B o combinaciones parciales como A y C o B y C mantiene la puerta cerrada.</w:t>
+        <w:t xml:space="preserve">El resultado tiene una interpretación física clara: la puerta de la granja se abre únicamente en 2 de las 8 combinaciones posibles. El botón C funciona como confirmación, ya que si no se pulsa la puerta no se abre. Además, los botones A y B deben estar en el mismo estado: los dos en reposo (condición 1) o los dos pulsados (condición 2). Si se pulsa solo A, solo B o combinaciones parciales como A y C o B y C, la puerta se queda cerrada.</w:t>
       </w:r>
     </w:p>
     <w:p>
@@ -4496,7 +4568,7 @@
           <w:sz w:val="24"/>
           <w:szCs w:val="24"/>
         </w:rPr>
-        <w:t xml:space="preserve">La simplificación algebraica redujo el circuito de cinco compuertas a solo dos, sin alterar su comportamiento, lo cual se comprobó formalmente con MATLAB. En la práctica esto se traduce en menor costo de componentes, menos conexiones susceptibles de falla y menor retardo de propagación de la señal.</w:t>
+        <w:t xml:space="preserve">La simplificación algebraica redujo el circuito de cinco compuertas a solo dos sin cambiar su comportamiento, y esto se comprobó con MATLAB. En la práctica, esto significa menor costo de componentes, menos conexiones que puedan fallar y una respuesta más rápida del circuito.</w:t>
       </w:r>
     </w:p>
     <w:p>
@@ -4510,7 +4582,7 @@
           <w:sz w:val="24"/>
           <w:szCs w:val="24"/>
         </w:rPr>
-        <w:t xml:space="preserve">Se concluye que el álgebra de Boole y las compuertas lógicas permiten traducir de forma sistemática un requerimiento verbal —las condiciones de apertura de una puerta— en un circuito digital funcional y óptimo: partir de la tabla de verdad garantiza que el diseño cumpla exactamente las especificaciones, la simplificación optimiza la implementación y la verificación por software valida el resultado antes de construir el circuito físico.</w:t>
+        <w:t xml:space="preserve">Se concluye que el álgebra de Boole y las compuertas lógicas permiten convertir paso a paso un requerimiento escrito, como las condiciones de apertura de una puerta, en un circuito digital que funciona y usa el menor número de componentes. Partir de la tabla de verdad garantiza que el diseño cumpla las especificaciones, la simplificación reduce el circuito y la comprobación con software valida el resultado antes de armar el circuito físico.</w:t>
       </w:r>
     </w:p>
     <w:p>

</xml_diff>

<commit_message>
Quitar las citas en el texto del reporte
Se eliminan las citas entre paréntesis del cuerpo; la lista de
referencias al final se mantiene sin cambios.

Co-Authored-By: Claude Fable 5 <noreply@anthropic.com>
Claude-Session: https://claude.ai/code/session_015UF77vNc2anNhC4cbLjXz9
</commit_message>
<xml_diff>
--- a/tarea-4-compuertas-logicas/Tarea4_Circuitos_con_compuertas_logicas.docx
+++ b/tarea-4-compuertas-logicas/Tarea4_Circuitos_con_compuertas_logicas.docx
@@ -252,7 +252,7 @@
           <w:sz w:val="24"/>
           <w:szCs w:val="24"/>
         </w:rPr>
-        <w:t xml:space="preserve">La Tabla 1 resume las compuertas lógicas básicas. Para cada una se indica su símbolo normalizado (norma ANSI/IEEE), su expresión booleana, la interpretación de su funcionamiento y un ejemplo sencillo de implementación en la vida cotidiana (Floyd, 2016; Tocci et al., 2017).</w:t>
+        <w:t xml:space="preserve">La Tabla 1 resume las compuertas lógicas básicas. Para cada una se indica su símbolo normalizado (norma ANSI/IEEE), su expresión booleana, la interpretación de su funcionamiento y un ejemplo sencillo de implementación en la vida cotidiana.</w:t>
       </w:r>
     </w:p>
     <w:p>
@@ -3142,7 +3142,7 @@
           <w:sz w:val="24"/>
           <w:szCs w:val="24"/>
         </w:rPr>
-        <w:t xml:space="preserve">La expresión entre paréntesis es exactamente la definición de la compuerta XNOR (equivalencia): vale 1 cuando A y B son iguales (Mano &amp; Ciletti, 2018). Por lo tanto, la función mínima queda:</w:t>
+        <w:t xml:space="preserve">La expresión entre paréntesis es exactamente la definición de la compuerta XNOR (equivalencia): vale 1 cuando A y B son iguales. Por lo tanto, la función mínima queda:</w:t>
       </w:r>
     </w:p>
     <w:p>
@@ -3837,7 +3837,7 @@
           <w:sz w:val="24"/>
           <w:szCs w:val="24"/>
         </w:rPr>
-        <w:t xml:space="preserve">Para verificar el diseño se escribió un script en MATLAB que evalúa las ocho combinaciones de entrada tanto con la función canónica como con la simplificada, mediante los operadores lógicos del lenguaje (The MathWorks, 2024), imprime la tabla de verdad resultante y comprueba con </w:t>
+        <w:t xml:space="preserve">Para verificar el diseño se escribió un script en MATLAB que evalúa las ocho combinaciones de entrada tanto con la función canónica como con la simplificada, imprime la tabla de verdad resultante y comprueba con </w:t>
       </w:r>
       <w:r>
         <w:rPr>

</xml_diff>

<commit_message>
Aplicar el feedback de la profesora a la tabla de verdad y la notación
La Tabla 2 ahora incluye las columnas de la función construida con las
condiciones de apertura (A', B', A'·B'·C, A·B·C) además de las entradas
y la salida. La salida se renombra de S a X en el reporte, los diagramas
y el script de MATLAB, y se aclara en el texto el origen del símbolo de
la XNOR. Se agrega una guía para grabar el video de la entrega.

Co-Authored-By: Claude Fable 5 <noreply@anthropic.com>
Claude-Session: https://claude.ai/code/session_015UF77vNc2anNhC4cbLjXz9
</commit_message>
<xml_diff>
--- a/tarea-4-compuertas-logicas/Tarea4_Circuitos_con_compuertas_logicas.docx
+++ b/tarea-4-compuertas-logicas/Tarea4_Circuitos_con_compuertas_logicas.docx
@@ -181,7 +181,7 @@
       <w:pPr>
         <w:pStyle w:val="Heading1"/>
         <w:keepNext/>
-        <w:spacing w:after="120" w:before="240"/>
+        <w:spacing w:after="120" w:before="180"/>
       </w:pPr>
       <w:r>
         <w:rPr>
@@ -227,7 +227,7 @@
       <w:pPr>
         <w:pStyle w:val="Heading1"/>
         <w:keepNext/>
-        <w:spacing w:after="120" w:before="240"/>
+        <w:spacing w:after="120" w:before="180"/>
       </w:pPr>
       <w:r>
         <w:rPr>
@@ -570,7 +570,7 @@
                 <w:sz w:val="20"/>
                 <w:szCs w:val="20"/>
               </w:rPr>
-              <w:t xml:space="preserve">S = A′</w:t>
+              <w:t xml:space="preserve">X = A′</w:t>
             </w:r>
           </w:p>
         </w:tc>
@@ -739,7 +739,7 @@
                 <w:sz w:val="20"/>
                 <w:szCs w:val="20"/>
               </w:rPr>
-              <w:t xml:space="preserve">S = A · B</w:t>
+              <w:t xml:space="preserve">X = A · B</w:t>
             </w:r>
           </w:p>
         </w:tc>
@@ -908,7 +908,7 @@
                 <w:sz w:val="20"/>
                 <w:szCs w:val="20"/>
               </w:rPr>
-              <w:t xml:space="preserve">S = A + B</w:t>
+              <w:t xml:space="preserve">X = A + B</w:t>
             </w:r>
           </w:p>
         </w:tc>
@@ -1077,7 +1077,7 @@
                 <w:sz w:val="20"/>
                 <w:szCs w:val="20"/>
               </w:rPr>
-              <w:t xml:space="preserve">S = (A · B)′</w:t>
+              <w:t xml:space="preserve">X = (A · B)′</w:t>
             </w:r>
           </w:p>
         </w:tc>
@@ -1246,7 +1246,7 @@
                 <w:sz w:val="20"/>
                 <w:szCs w:val="20"/>
               </w:rPr>
-              <w:t xml:space="preserve">S = (A + B)′</w:t>
+              <w:t xml:space="preserve">X = (A + B)′</w:t>
             </w:r>
           </w:p>
         </w:tc>
@@ -1415,7 +1415,7 @@
                 <w:sz w:val="20"/>
                 <w:szCs w:val="20"/>
               </w:rPr>
-              <w:t xml:space="preserve">S = A ⊕ B</w:t>
+              <w:t xml:space="preserve">X = A ⊕ B</w:t>
             </w:r>
           </w:p>
         </w:tc>
@@ -1584,7 +1584,7 @@
                 <w:sz w:val="20"/>
                 <w:szCs w:val="20"/>
               </w:rPr>
-              <w:t xml:space="preserve">S = (A ⊕ B)′ = A ⊙ B</w:t>
+              <w:t xml:space="preserve">X = (A ⊕ B)′ = A ⊙ B</w:t>
             </w:r>
           </w:p>
         </w:tc>
@@ -1646,7 +1646,7 @@
       <w:pPr>
         <w:pStyle w:val="Heading1"/>
         <w:keepNext/>
-        <w:spacing w:after="120" w:before="240"/>
+        <w:spacing w:after="120" w:before="180"/>
       </w:pPr>
       <w:r>
         <w:rPr>
@@ -1671,7 +1671,7 @@
           <w:sz w:val="24"/>
           <w:szCs w:val="24"/>
         </w:rPr>
-        <w:t xml:space="preserve">En una granja se requiere una puerta electrónica que solo pueda abrirse cuando se pulse una determinada combinación de tres botones. Se definen las variables de entrada A, B y C, donde el valor 1 representa botón pulsado y el valor 0 botón en reposo. La salida S representa el estado de la puerta: S = 1 indica que la puerta se abre y S = 0 que permanece cerrada.</w:t>
+        <w:t xml:space="preserve">En una granja se requiere una puerta electrónica que solo pueda abrirse cuando se pulse una determinada combinación de tres botones. Se definen las variables de entrada A, B y C, donde el valor 1 representa botón pulsado y el valor 0 botón en reposo. La salida X representa el estado de la puerta: X = 1 indica que la puerta se abre y X = 0 que permanece cerrada.</w:t>
       </w:r>
     </w:p>
     <w:p>
@@ -1699,7 +1699,7 @@
           <w:sz w:val="24"/>
           <w:szCs w:val="24"/>
         </w:rPr>
-        <w:t xml:space="preserve">Con base en el análisis combinatorio del módulo anterior, la Tabla 2 muestra la tabla de verdad completa del sistema con las 2³ = 8 combinaciones de entrada.</w:t>
+        <w:t xml:space="preserve">Con base en el análisis combinatorio del módulo anterior, la Tabla 2 muestra la tabla de verdad completa del sistema con las 2³ = 8 combinaciones de entrada. Además de A, B y C, la tabla incluye las columnas necesarias para evaluar la función de las condiciones de apertura: las negaciones A′ y B′, el término A′·B′·C de la condición 1 y el término A·B·C de la condición 2. La salida X es la suma lógica (OR) de los dos términos.</w:t>
       </w:r>
     </w:p>
     <w:p>
@@ -1716,12 +1716,12 @@
           <w:sz w:val="20"/>
           <w:szCs w:val="20"/>
         </w:rPr>
-        <w:t xml:space="preserve">Tabla 2. Tabla de verdad de la puerta electrónica de la granja.</w:t>
+        <w:t xml:space="preserve">Tabla 2. Tabla de verdad de la puerta electrónica con los términos de las condiciones de apertura.</w:t>
       </w:r>
     </w:p>
     <w:tbl>
       <w:tblPr>
-        <w:tblW w:type="dxa" w:w="6700"/>
+        <w:tblW w:type="dxa" w:w="6900"/>
         <w:jc w:val="center"/>
         <w:tblBorders>
           <w:top w:val="single" w:color="auto" w:sz="4"/>
@@ -1733,11 +1733,14 @@
         </w:tblBorders>
       </w:tblPr>
       <w:tblGrid>
+        <w:gridCol w:w="650"/>
+        <w:gridCol w:w="650"/>
+        <w:gridCol w:w="650"/>
         <w:gridCol w:w="700"/>
         <w:gridCol w:w="700"/>
-        <w:gridCol w:w="700"/>
-        <w:gridCol w:w="700"/>
-        <w:gridCol w:w="3900"/>
+        <w:gridCol w:w="1500"/>
+        <w:gridCol w:w="1300"/>
+        <w:gridCol w:w="750"/>
       </w:tblGrid>
       <w:tr>
         <w:trPr>
@@ -1746,6 +1749,93 @@
         </w:trPr>
         <w:tc>
           <w:tcPr>
+            <w:tcW w:type="dxa" w:w="650"/>
+            <w:shd w:fill="D9D9D9" w:val="clear"/>
+            <w:tcMar>
+              <w:top w:type="dxa" w:w="40"/>
+              <w:left w:type="dxa" w:w="80"/>
+              <w:bottom w:type="dxa" w:w="40"/>
+              <w:right w:type="dxa" w:w="80"/>
+            </w:tcMar>
+            <w:vAlign w:val="center"/>
+          </w:tcPr>
+          <w:p>
+            <w:pPr>
+              <w:spacing w:after="30" w:before="30" w:line="240" w:lineRule="auto"/>
+              <w:jc w:val="center"/>
+            </w:pPr>
+            <w:r>
+              <w:rPr>
+                <w:rFonts w:ascii="Arial" w:cs="Arial" w:eastAsia="Arial" w:hAnsi="Arial"/>
+                <w:b/>
+                <w:bCs/>
+                <w:sz w:val="20"/>
+                <w:szCs w:val="20"/>
+              </w:rPr>
+              <w:t xml:space="preserve">A</w:t>
+            </w:r>
+          </w:p>
+        </w:tc>
+        <w:tc>
+          <w:tcPr>
+            <w:tcW w:type="dxa" w:w="650"/>
+            <w:shd w:fill="D9D9D9" w:val="clear"/>
+            <w:tcMar>
+              <w:top w:type="dxa" w:w="40"/>
+              <w:left w:type="dxa" w:w="80"/>
+              <w:bottom w:type="dxa" w:w="40"/>
+              <w:right w:type="dxa" w:w="80"/>
+            </w:tcMar>
+            <w:vAlign w:val="center"/>
+          </w:tcPr>
+          <w:p>
+            <w:pPr>
+              <w:spacing w:after="30" w:before="30" w:line="240" w:lineRule="auto"/>
+              <w:jc w:val="center"/>
+            </w:pPr>
+            <w:r>
+              <w:rPr>
+                <w:rFonts w:ascii="Arial" w:cs="Arial" w:eastAsia="Arial" w:hAnsi="Arial"/>
+                <w:b/>
+                <w:bCs/>
+                <w:sz w:val="20"/>
+                <w:szCs w:val="20"/>
+              </w:rPr>
+              <w:t xml:space="preserve">B</w:t>
+            </w:r>
+          </w:p>
+        </w:tc>
+        <w:tc>
+          <w:tcPr>
+            <w:tcW w:type="dxa" w:w="650"/>
+            <w:shd w:fill="D9D9D9" w:val="clear"/>
+            <w:tcMar>
+              <w:top w:type="dxa" w:w="40"/>
+              <w:left w:type="dxa" w:w="80"/>
+              <w:bottom w:type="dxa" w:w="40"/>
+              <w:right w:type="dxa" w:w="80"/>
+            </w:tcMar>
+            <w:vAlign w:val="center"/>
+          </w:tcPr>
+          <w:p>
+            <w:pPr>
+              <w:spacing w:after="30" w:before="30" w:line="240" w:lineRule="auto"/>
+              <w:jc w:val="center"/>
+            </w:pPr>
+            <w:r>
+              <w:rPr>
+                <w:rFonts w:ascii="Arial" w:cs="Arial" w:eastAsia="Arial" w:hAnsi="Arial"/>
+                <w:b/>
+                <w:bCs/>
+                <w:sz w:val="20"/>
+                <w:szCs w:val="20"/>
+              </w:rPr>
+              <w:t xml:space="preserve">C</w:t>
+            </w:r>
+          </w:p>
+        </w:tc>
+        <w:tc>
+          <w:tcPr>
             <w:tcW w:type="dxa" w:w="700"/>
             <w:shd w:fill="D9D9D9" w:val="clear"/>
             <w:tcMar>
@@ -1769,7 +1859,7 @@
                 <w:sz w:val="20"/>
                 <w:szCs w:val="20"/>
               </w:rPr>
-              <w:t xml:space="preserve">A</w:t>
+              <w:t xml:space="preserve">A′</w:t>
             </w:r>
           </w:p>
         </w:tc>
@@ -1798,13 +1888,13 @@
                 <w:sz w:val="20"/>
                 <w:szCs w:val="20"/>
               </w:rPr>
-              <w:t xml:space="preserve">B</w:t>
-            </w:r>
-          </w:p>
-        </w:tc>
-        <w:tc>
-          <w:tcPr>
-            <w:tcW w:type="dxa" w:w="700"/>
+              <w:t xml:space="preserve">B′</w:t>
+            </w:r>
+          </w:p>
+        </w:tc>
+        <w:tc>
+          <w:tcPr>
+            <w:tcW w:type="dxa" w:w="1500"/>
             <w:shd w:fill="D9D9D9" w:val="clear"/>
             <w:tcMar>
               <w:top w:type="dxa" w:w="40"/>
@@ -1827,13 +1917,13 @@
                 <w:sz w:val="20"/>
                 <w:szCs w:val="20"/>
               </w:rPr>
-              <w:t xml:space="preserve">C</w:t>
-            </w:r>
-          </w:p>
-        </w:tc>
-        <w:tc>
-          <w:tcPr>
-            <w:tcW w:type="dxa" w:w="700"/>
+              <w:t xml:space="preserve">A′·B′·C</w:t>
+            </w:r>
+          </w:p>
+        </w:tc>
+        <w:tc>
+          <w:tcPr>
+            <w:tcW w:type="dxa" w:w="1300"/>
             <w:shd w:fill="D9D9D9" w:val="clear"/>
             <w:tcMar>
               <w:top w:type="dxa" w:w="40"/>
@@ -1856,13 +1946,13 @@
                 <w:sz w:val="20"/>
                 <w:szCs w:val="20"/>
               </w:rPr>
-              <w:t xml:space="preserve">S</w:t>
-            </w:r>
-          </w:p>
-        </w:tc>
-        <w:tc>
-          <w:tcPr>
-            <w:tcW w:type="dxa" w:w="3900"/>
+              <w:t xml:space="preserve">A·B·C</w:t>
+            </w:r>
+          </w:p>
+        </w:tc>
+        <w:tc>
+          <w:tcPr>
+            <w:tcW w:type="dxa" w:w="750"/>
             <w:shd w:fill="D9D9D9" w:val="clear"/>
             <w:tcMar>
               <w:top w:type="dxa" w:w="40"/>
@@ -1885,7 +1975,7 @@
                 <w:sz w:val="20"/>
                 <w:szCs w:val="20"/>
               </w:rPr>
-              <w:t xml:space="preserve">Interpretación</w:t>
+              <w:t xml:space="preserve">X</w:t>
             </w:r>
           </w:p>
         </w:tc>
@@ -1896,6 +1986,90 @@
         </w:trPr>
         <w:tc>
           <w:tcPr>
+            <w:tcW w:type="dxa" w:w="650"/>
+            <w:tcMar>
+              <w:top w:type="dxa" w:w="40"/>
+              <w:left w:type="dxa" w:w="80"/>
+              <w:bottom w:type="dxa" w:w="40"/>
+              <w:right w:type="dxa" w:w="80"/>
+            </w:tcMar>
+            <w:vAlign w:val="center"/>
+          </w:tcPr>
+          <w:p>
+            <w:pPr>
+              <w:spacing w:after="30" w:before="30" w:line="240" w:lineRule="auto"/>
+              <w:jc w:val="center"/>
+            </w:pPr>
+            <w:r>
+              <w:rPr>
+                <w:rFonts w:ascii="Arial" w:cs="Arial" w:eastAsia="Arial" w:hAnsi="Arial"/>
+                <w:b w:val="false"/>
+                <w:bCs w:val="false"/>
+                <w:sz w:val="20"/>
+                <w:szCs w:val="20"/>
+              </w:rPr>
+              <w:t xml:space="preserve">0</w:t>
+            </w:r>
+          </w:p>
+        </w:tc>
+        <w:tc>
+          <w:tcPr>
+            <w:tcW w:type="dxa" w:w="650"/>
+            <w:tcMar>
+              <w:top w:type="dxa" w:w="40"/>
+              <w:left w:type="dxa" w:w="80"/>
+              <w:bottom w:type="dxa" w:w="40"/>
+              <w:right w:type="dxa" w:w="80"/>
+            </w:tcMar>
+            <w:vAlign w:val="center"/>
+          </w:tcPr>
+          <w:p>
+            <w:pPr>
+              <w:spacing w:after="30" w:before="30" w:line="240" w:lineRule="auto"/>
+              <w:jc w:val="center"/>
+            </w:pPr>
+            <w:r>
+              <w:rPr>
+                <w:rFonts w:ascii="Arial" w:cs="Arial" w:eastAsia="Arial" w:hAnsi="Arial"/>
+                <w:b w:val="false"/>
+                <w:bCs w:val="false"/>
+                <w:sz w:val="20"/>
+                <w:szCs w:val="20"/>
+              </w:rPr>
+              <w:t xml:space="preserve">0</w:t>
+            </w:r>
+          </w:p>
+        </w:tc>
+        <w:tc>
+          <w:tcPr>
+            <w:tcW w:type="dxa" w:w="650"/>
+            <w:tcMar>
+              <w:top w:type="dxa" w:w="40"/>
+              <w:left w:type="dxa" w:w="80"/>
+              <w:bottom w:type="dxa" w:w="40"/>
+              <w:right w:type="dxa" w:w="80"/>
+            </w:tcMar>
+            <w:vAlign w:val="center"/>
+          </w:tcPr>
+          <w:p>
+            <w:pPr>
+              <w:spacing w:after="30" w:before="30" w:line="240" w:lineRule="auto"/>
+              <w:jc w:val="center"/>
+            </w:pPr>
+            <w:r>
+              <w:rPr>
+                <w:rFonts w:ascii="Arial" w:cs="Arial" w:eastAsia="Arial" w:hAnsi="Arial"/>
+                <w:b w:val="false"/>
+                <w:bCs w:val="false"/>
+                <w:sz w:val="20"/>
+                <w:szCs w:val="20"/>
+              </w:rPr>
+              <w:t xml:space="preserve">0</w:t>
+            </w:r>
+          </w:p>
+        </w:tc>
+        <w:tc>
+          <w:tcPr>
             <w:tcW w:type="dxa" w:w="700"/>
             <w:tcMar>
               <w:top w:type="dxa" w:w="40"/>
@@ -1918,13 +2092,69 @@
                 <w:sz w:val="20"/>
                 <w:szCs w:val="20"/>
               </w:rPr>
+              <w:t xml:space="preserve">1</w:t>
+            </w:r>
+          </w:p>
+        </w:tc>
+        <w:tc>
+          <w:tcPr>
+            <w:tcW w:type="dxa" w:w="700"/>
+            <w:tcMar>
+              <w:top w:type="dxa" w:w="40"/>
+              <w:left w:type="dxa" w:w="80"/>
+              <w:bottom w:type="dxa" w:w="40"/>
+              <w:right w:type="dxa" w:w="80"/>
+            </w:tcMar>
+            <w:vAlign w:val="center"/>
+          </w:tcPr>
+          <w:p>
+            <w:pPr>
+              <w:spacing w:after="30" w:before="30" w:line="240" w:lineRule="auto"/>
+              <w:jc w:val="center"/>
+            </w:pPr>
+            <w:r>
+              <w:rPr>
+                <w:rFonts w:ascii="Arial" w:cs="Arial" w:eastAsia="Arial" w:hAnsi="Arial"/>
+                <w:b w:val="false"/>
+                <w:bCs w:val="false"/>
+                <w:sz w:val="20"/>
+                <w:szCs w:val="20"/>
+              </w:rPr>
+              <w:t xml:space="preserve">1</w:t>
+            </w:r>
+          </w:p>
+        </w:tc>
+        <w:tc>
+          <w:tcPr>
+            <w:tcW w:type="dxa" w:w="1500"/>
+            <w:tcMar>
+              <w:top w:type="dxa" w:w="40"/>
+              <w:left w:type="dxa" w:w="80"/>
+              <w:bottom w:type="dxa" w:w="40"/>
+              <w:right w:type="dxa" w:w="80"/>
+            </w:tcMar>
+            <w:vAlign w:val="center"/>
+          </w:tcPr>
+          <w:p>
+            <w:pPr>
+              <w:spacing w:after="30" w:before="30" w:line="240" w:lineRule="auto"/>
+              <w:jc w:val="center"/>
+            </w:pPr>
+            <w:r>
+              <w:rPr>
+                <w:rFonts w:ascii="Arial" w:cs="Arial" w:eastAsia="Arial" w:hAnsi="Arial"/>
+                <w:b w:val="false"/>
+                <w:bCs w:val="false"/>
+                <w:sz w:val="20"/>
+                <w:szCs w:val="20"/>
+              </w:rPr>
               <w:t xml:space="preserve">0</w:t>
             </w:r>
           </w:p>
         </w:tc>
         <w:tc>
           <w:tcPr>
-            <w:tcW w:type="dxa" w:w="700"/>
+            <w:tcW w:type="dxa" w:w="1300"/>
             <w:tcMar>
               <w:top w:type="dxa" w:w="40"/>
               <w:left w:type="dxa" w:w="80"/>
@@ -1952,7 +2182,7 @@
         </w:tc>
         <w:tc>
           <w:tcPr>
-            <w:tcW w:type="dxa" w:w="700"/>
+            <w:tcW w:type="dxa" w:w="750"/>
             <w:tcMar>
               <w:top w:type="dxa" w:w="40"/>
               <w:left w:type="dxa" w:w="80"/>
@@ -1975,62 +2205,6 @@
                 <w:szCs w:val="20"/>
               </w:rPr>
               <w:t xml:space="preserve">0</w:t>
-            </w:r>
-          </w:p>
-        </w:tc>
-        <w:tc>
-          <w:tcPr>
-            <w:tcW w:type="dxa" w:w="700"/>
-            <w:tcMar>
-              <w:top w:type="dxa" w:w="40"/>
-              <w:left w:type="dxa" w:w="80"/>
-              <w:bottom w:type="dxa" w:w="40"/>
-              <w:right w:type="dxa" w:w="80"/>
-            </w:tcMar>
-            <w:vAlign w:val="center"/>
-          </w:tcPr>
-          <w:p>
-            <w:pPr>
-              <w:spacing w:after="30" w:before="30" w:line="240" w:lineRule="auto"/>
-              <w:jc w:val="center"/>
-            </w:pPr>
-            <w:r>
-              <w:rPr>
-                <w:rFonts w:ascii="Arial" w:cs="Arial" w:eastAsia="Arial" w:hAnsi="Arial"/>
-                <w:b w:val="false"/>
-                <w:bCs w:val="false"/>
-                <w:sz w:val="20"/>
-                <w:szCs w:val="20"/>
-              </w:rPr>
-              <w:t xml:space="preserve">0</w:t>
-            </w:r>
-          </w:p>
-        </w:tc>
-        <w:tc>
-          <w:tcPr>
-            <w:tcW w:type="dxa" w:w="3900"/>
-            <w:tcMar>
-              <w:top w:type="dxa" w:w="40"/>
-              <w:left w:type="dxa" w:w="80"/>
-              <w:bottom w:type="dxa" w:w="40"/>
-              <w:right w:type="dxa" w:w="80"/>
-            </w:tcMar>
-            <w:vAlign w:val="center"/>
-          </w:tcPr>
-          <w:p>
-            <w:pPr>
-              <w:spacing w:after="30" w:before="30" w:line="240" w:lineRule="auto"/>
-              <w:jc w:val="left"/>
-            </w:pPr>
-            <w:r>
-              <w:rPr>
-                <w:rFonts w:ascii="Arial" w:cs="Arial" w:eastAsia="Arial" w:hAnsi="Arial"/>
-                <w:b w:val="false"/>
-                <w:bCs w:val="false"/>
-                <w:sz w:val="20"/>
-                <w:szCs w:val="20"/>
-              </w:rPr>
-              <w:t xml:space="preserve">La puerta permanece cerrada</w:t>
             </w:r>
           </w:p>
         </w:tc>
@@ -2041,6 +2215,90 @@
         </w:trPr>
         <w:tc>
           <w:tcPr>
+            <w:tcW w:type="dxa" w:w="650"/>
+            <w:tcMar>
+              <w:top w:type="dxa" w:w="40"/>
+              <w:left w:type="dxa" w:w="80"/>
+              <w:bottom w:type="dxa" w:w="40"/>
+              <w:right w:type="dxa" w:w="80"/>
+            </w:tcMar>
+            <w:vAlign w:val="center"/>
+          </w:tcPr>
+          <w:p>
+            <w:pPr>
+              <w:spacing w:after="30" w:before="30" w:line="240" w:lineRule="auto"/>
+              <w:jc w:val="center"/>
+            </w:pPr>
+            <w:r>
+              <w:rPr>
+                <w:rFonts w:ascii="Arial" w:cs="Arial" w:eastAsia="Arial" w:hAnsi="Arial"/>
+                <w:b w:val="false"/>
+                <w:bCs w:val="false"/>
+                <w:sz w:val="20"/>
+                <w:szCs w:val="20"/>
+              </w:rPr>
+              <w:t xml:space="preserve">0</w:t>
+            </w:r>
+          </w:p>
+        </w:tc>
+        <w:tc>
+          <w:tcPr>
+            <w:tcW w:type="dxa" w:w="650"/>
+            <w:tcMar>
+              <w:top w:type="dxa" w:w="40"/>
+              <w:left w:type="dxa" w:w="80"/>
+              <w:bottom w:type="dxa" w:w="40"/>
+              <w:right w:type="dxa" w:w="80"/>
+            </w:tcMar>
+            <w:vAlign w:val="center"/>
+          </w:tcPr>
+          <w:p>
+            <w:pPr>
+              <w:spacing w:after="30" w:before="30" w:line="240" w:lineRule="auto"/>
+              <w:jc w:val="center"/>
+            </w:pPr>
+            <w:r>
+              <w:rPr>
+                <w:rFonts w:ascii="Arial" w:cs="Arial" w:eastAsia="Arial" w:hAnsi="Arial"/>
+                <w:b w:val="false"/>
+                <w:bCs w:val="false"/>
+                <w:sz w:val="20"/>
+                <w:szCs w:val="20"/>
+              </w:rPr>
+              <w:t xml:space="preserve">0</w:t>
+            </w:r>
+          </w:p>
+        </w:tc>
+        <w:tc>
+          <w:tcPr>
+            <w:tcW w:type="dxa" w:w="650"/>
+            <w:tcMar>
+              <w:top w:type="dxa" w:w="40"/>
+              <w:left w:type="dxa" w:w="80"/>
+              <w:bottom w:type="dxa" w:w="40"/>
+              <w:right w:type="dxa" w:w="80"/>
+            </w:tcMar>
+            <w:vAlign w:val="center"/>
+          </w:tcPr>
+          <w:p>
+            <w:pPr>
+              <w:spacing w:after="30" w:before="30" w:line="240" w:lineRule="auto"/>
+              <w:jc w:val="center"/>
+            </w:pPr>
+            <w:r>
+              <w:rPr>
+                <w:rFonts w:ascii="Arial" w:cs="Arial" w:eastAsia="Arial" w:hAnsi="Arial"/>
+                <w:b w:val="false"/>
+                <w:bCs w:val="false"/>
+                <w:sz w:val="20"/>
+                <w:szCs w:val="20"/>
+              </w:rPr>
+              <w:t xml:space="preserve">1</w:t>
+            </w:r>
+          </w:p>
+        </w:tc>
+        <w:tc>
+          <w:tcPr>
             <w:tcW w:type="dxa" w:w="700"/>
             <w:tcMar>
               <w:top w:type="dxa" w:w="40"/>
@@ -2063,69 +2321,98 @@
                 <w:sz w:val="20"/>
                 <w:szCs w:val="20"/>
               </w:rPr>
+              <w:t xml:space="preserve">1</w:t>
+            </w:r>
+          </w:p>
+        </w:tc>
+        <w:tc>
+          <w:tcPr>
+            <w:tcW w:type="dxa" w:w="700"/>
+            <w:tcMar>
+              <w:top w:type="dxa" w:w="40"/>
+              <w:left w:type="dxa" w:w="80"/>
+              <w:bottom w:type="dxa" w:w="40"/>
+              <w:right w:type="dxa" w:w="80"/>
+            </w:tcMar>
+            <w:vAlign w:val="center"/>
+          </w:tcPr>
+          <w:p>
+            <w:pPr>
+              <w:spacing w:after="30" w:before="30" w:line="240" w:lineRule="auto"/>
+              <w:jc w:val="center"/>
+            </w:pPr>
+            <w:r>
+              <w:rPr>
+                <w:rFonts w:ascii="Arial" w:cs="Arial" w:eastAsia="Arial" w:hAnsi="Arial"/>
+                <w:b w:val="false"/>
+                <w:bCs w:val="false"/>
+                <w:sz w:val="20"/>
+                <w:szCs w:val="20"/>
+              </w:rPr>
+              <w:t xml:space="preserve">1</w:t>
+            </w:r>
+          </w:p>
+        </w:tc>
+        <w:tc>
+          <w:tcPr>
+            <w:tcW w:type="dxa" w:w="1500"/>
+            <w:shd w:fill="E2EFDA" w:val="clear"/>
+            <w:tcMar>
+              <w:top w:type="dxa" w:w="40"/>
+              <w:left w:type="dxa" w:w="80"/>
+              <w:bottom w:type="dxa" w:w="40"/>
+              <w:right w:type="dxa" w:w="80"/>
+            </w:tcMar>
+            <w:vAlign w:val="center"/>
+          </w:tcPr>
+          <w:p>
+            <w:pPr>
+              <w:spacing w:after="30" w:before="30" w:line="240" w:lineRule="auto"/>
+              <w:jc w:val="center"/>
+            </w:pPr>
+            <w:r>
+              <w:rPr>
+                <w:rFonts w:ascii="Arial" w:cs="Arial" w:eastAsia="Arial" w:hAnsi="Arial"/>
+                <w:b w:val="false"/>
+                <w:bCs w:val="false"/>
+                <w:sz w:val="20"/>
+                <w:szCs w:val="20"/>
+              </w:rPr>
+              <w:t xml:space="preserve">1</w:t>
+            </w:r>
+          </w:p>
+        </w:tc>
+        <w:tc>
+          <w:tcPr>
+            <w:tcW w:type="dxa" w:w="1300"/>
+            <w:tcMar>
+              <w:top w:type="dxa" w:w="40"/>
+              <w:left w:type="dxa" w:w="80"/>
+              <w:bottom w:type="dxa" w:w="40"/>
+              <w:right w:type="dxa" w:w="80"/>
+            </w:tcMar>
+            <w:vAlign w:val="center"/>
+          </w:tcPr>
+          <w:p>
+            <w:pPr>
+              <w:spacing w:after="30" w:before="30" w:line="240" w:lineRule="auto"/>
+              <w:jc w:val="center"/>
+            </w:pPr>
+            <w:r>
+              <w:rPr>
+                <w:rFonts w:ascii="Arial" w:cs="Arial" w:eastAsia="Arial" w:hAnsi="Arial"/>
+                <w:b w:val="false"/>
+                <w:bCs w:val="false"/>
+                <w:sz w:val="20"/>
+                <w:szCs w:val="20"/>
+              </w:rPr>
               <w:t xml:space="preserve">0</w:t>
             </w:r>
           </w:p>
         </w:tc>
         <w:tc>
           <w:tcPr>
-            <w:tcW w:type="dxa" w:w="700"/>
-            <w:tcMar>
-              <w:top w:type="dxa" w:w="40"/>
-              <w:left w:type="dxa" w:w="80"/>
-              <w:bottom w:type="dxa" w:w="40"/>
-              <w:right w:type="dxa" w:w="80"/>
-            </w:tcMar>
-            <w:vAlign w:val="center"/>
-          </w:tcPr>
-          <w:p>
-            <w:pPr>
-              <w:spacing w:after="30" w:before="30" w:line="240" w:lineRule="auto"/>
-              <w:jc w:val="center"/>
-            </w:pPr>
-            <w:r>
-              <w:rPr>
-                <w:rFonts w:ascii="Arial" w:cs="Arial" w:eastAsia="Arial" w:hAnsi="Arial"/>
-                <w:b w:val="false"/>
-                <w:bCs w:val="false"/>
-                <w:sz w:val="20"/>
-                <w:szCs w:val="20"/>
-              </w:rPr>
-              <w:t xml:space="preserve">0</w:t>
-            </w:r>
-          </w:p>
-        </w:tc>
-        <w:tc>
-          <w:tcPr>
-            <w:tcW w:type="dxa" w:w="700"/>
-            <w:tcMar>
-              <w:top w:type="dxa" w:w="40"/>
-              <w:left w:type="dxa" w:w="80"/>
-              <w:bottom w:type="dxa" w:w="40"/>
-              <w:right w:type="dxa" w:w="80"/>
-            </w:tcMar>
-            <w:vAlign w:val="center"/>
-          </w:tcPr>
-          <w:p>
-            <w:pPr>
-              <w:spacing w:after="30" w:before="30" w:line="240" w:lineRule="auto"/>
-              <w:jc w:val="center"/>
-            </w:pPr>
-            <w:r>
-              <w:rPr>
-                <w:rFonts w:ascii="Arial" w:cs="Arial" w:eastAsia="Arial" w:hAnsi="Arial"/>
-                <w:b w:val="false"/>
-                <w:bCs w:val="false"/>
-                <w:sz w:val="20"/>
-                <w:szCs w:val="20"/>
-              </w:rPr>
-              <w:t xml:space="preserve">1</w:t>
-            </w:r>
-          </w:p>
-        </w:tc>
-        <w:tc>
-          <w:tcPr>
-            <w:tcW w:type="dxa" w:w="700"/>
+            <w:tcW w:type="dxa" w:w="750"/>
             <w:shd w:fill="E2EFDA" w:val="clear"/>
             <w:tcMar>
               <w:top w:type="dxa" w:w="40"/>
@@ -2149,34 +2436,6 @@
                 <w:szCs w:val="20"/>
               </w:rPr>
               <w:t xml:space="preserve">1</w:t>
-            </w:r>
-          </w:p>
-        </w:tc>
-        <w:tc>
-          <w:tcPr>
-            <w:tcW w:type="dxa" w:w="3900"/>
-            <w:tcMar>
-              <w:top w:type="dxa" w:w="40"/>
-              <w:left w:type="dxa" w:w="80"/>
-              <w:bottom w:type="dxa" w:w="40"/>
-              <w:right w:type="dxa" w:w="80"/>
-            </w:tcMar>
-            <w:vAlign w:val="center"/>
-          </w:tcPr>
-          <w:p>
-            <w:pPr>
-              <w:spacing w:after="30" w:before="30" w:line="240" w:lineRule="auto"/>
-              <w:jc w:val="left"/>
-            </w:pPr>
-            <w:r>
-              <w:rPr>
-                <w:rFonts w:ascii="Arial" w:cs="Arial" w:eastAsia="Arial" w:hAnsi="Arial"/>
-                <w:b w:val="false"/>
-                <w:bCs w:val="false"/>
-                <w:sz w:val="20"/>
-                <w:szCs w:val="20"/>
-              </w:rPr>
-              <w:t xml:space="preserve">Condición 1: C pulsado, A y B en reposo</w:t>
             </w:r>
           </w:p>
         </w:tc>
@@ -2187,6 +2446,90 @@
         </w:trPr>
         <w:tc>
           <w:tcPr>
+            <w:tcW w:type="dxa" w:w="650"/>
+            <w:tcMar>
+              <w:top w:type="dxa" w:w="40"/>
+              <w:left w:type="dxa" w:w="80"/>
+              <w:bottom w:type="dxa" w:w="40"/>
+              <w:right w:type="dxa" w:w="80"/>
+            </w:tcMar>
+            <w:vAlign w:val="center"/>
+          </w:tcPr>
+          <w:p>
+            <w:pPr>
+              <w:spacing w:after="30" w:before="30" w:line="240" w:lineRule="auto"/>
+              <w:jc w:val="center"/>
+            </w:pPr>
+            <w:r>
+              <w:rPr>
+                <w:rFonts w:ascii="Arial" w:cs="Arial" w:eastAsia="Arial" w:hAnsi="Arial"/>
+                <w:b w:val="false"/>
+                <w:bCs w:val="false"/>
+                <w:sz w:val="20"/>
+                <w:szCs w:val="20"/>
+              </w:rPr>
+              <w:t xml:space="preserve">0</w:t>
+            </w:r>
+          </w:p>
+        </w:tc>
+        <w:tc>
+          <w:tcPr>
+            <w:tcW w:type="dxa" w:w="650"/>
+            <w:tcMar>
+              <w:top w:type="dxa" w:w="40"/>
+              <w:left w:type="dxa" w:w="80"/>
+              <w:bottom w:type="dxa" w:w="40"/>
+              <w:right w:type="dxa" w:w="80"/>
+            </w:tcMar>
+            <w:vAlign w:val="center"/>
+          </w:tcPr>
+          <w:p>
+            <w:pPr>
+              <w:spacing w:after="30" w:before="30" w:line="240" w:lineRule="auto"/>
+              <w:jc w:val="center"/>
+            </w:pPr>
+            <w:r>
+              <w:rPr>
+                <w:rFonts w:ascii="Arial" w:cs="Arial" w:eastAsia="Arial" w:hAnsi="Arial"/>
+                <w:b w:val="false"/>
+                <w:bCs w:val="false"/>
+                <w:sz w:val="20"/>
+                <w:szCs w:val="20"/>
+              </w:rPr>
+              <w:t xml:space="preserve">1</w:t>
+            </w:r>
+          </w:p>
+        </w:tc>
+        <w:tc>
+          <w:tcPr>
+            <w:tcW w:type="dxa" w:w="650"/>
+            <w:tcMar>
+              <w:top w:type="dxa" w:w="40"/>
+              <w:left w:type="dxa" w:w="80"/>
+              <w:bottom w:type="dxa" w:w="40"/>
+              <w:right w:type="dxa" w:w="80"/>
+            </w:tcMar>
+            <w:vAlign w:val="center"/>
+          </w:tcPr>
+          <w:p>
+            <w:pPr>
+              <w:spacing w:after="30" w:before="30" w:line="240" w:lineRule="auto"/>
+              <w:jc w:val="center"/>
+            </w:pPr>
+            <w:r>
+              <w:rPr>
+                <w:rFonts w:ascii="Arial" w:cs="Arial" w:eastAsia="Arial" w:hAnsi="Arial"/>
+                <w:b w:val="false"/>
+                <w:bCs w:val="false"/>
+                <w:sz w:val="20"/>
+                <w:szCs w:val="20"/>
+              </w:rPr>
+              <w:t xml:space="preserve">0</w:t>
+            </w:r>
+          </w:p>
+        </w:tc>
+        <w:tc>
+          <w:tcPr>
             <w:tcW w:type="dxa" w:w="700"/>
             <w:tcMar>
               <w:top w:type="dxa" w:w="40"/>
@@ -2209,41 +2552,41 @@
                 <w:sz w:val="20"/>
                 <w:szCs w:val="20"/>
               </w:rPr>
+              <w:t xml:space="preserve">1</w:t>
+            </w:r>
+          </w:p>
+        </w:tc>
+        <w:tc>
+          <w:tcPr>
+            <w:tcW w:type="dxa" w:w="700"/>
+            <w:tcMar>
+              <w:top w:type="dxa" w:w="40"/>
+              <w:left w:type="dxa" w:w="80"/>
+              <w:bottom w:type="dxa" w:w="40"/>
+              <w:right w:type="dxa" w:w="80"/>
+            </w:tcMar>
+            <w:vAlign w:val="center"/>
+          </w:tcPr>
+          <w:p>
+            <w:pPr>
+              <w:spacing w:after="30" w:before="30" w:line="240" w:lineRule="auto"/>
+              <w:jc w:val="center"/>
+            </w:pPr>
+            <w:r>
+              <w:rPr>
+                <w:rFonts w:ascii="Arial" w:cs="Arial" w:eastAsia="Arial" w:hAnsi="Arial"/>
+                <w:b w:val="false"/>
+                <w:bCs w:val="false"/>
+                <w:sz w:val="20"/>
+                <w:szCs w:val="20"/>
+              </w:rPr>
               <w:t xml:space="preserve">0</w:t>
             </w:r>
           </w:p>
         </w:tc>
         <w:tc>
           <w:tcPr>
-            <w:tcW w:type="dxa" w:w="700"/>
-            <w:tcMar>
-              <w:top w:type="dxa" w:w="40"/>
-              <w:left w:type="dxa" w:w="80"/>
-              <w:bottom w:type="dxa" w:w="40"/>
-              <w:right w:type="dxa" w:w="80"/>
-            </w:tcMar>
-            <w:vAlign w:val="center"/>
-          </w:tcPr>
-          <w:p>
-            <w:pPr>
-              <w:spacing w:after="30" w:before="30" w:line="240" w:lineRule="auto"/>
-              <w:jc w:val="center"/>
-            </w:pPr>
-            <w:r>
-              <w:rPr>
-                <w:rFonts w:ascii="Arial" w:cs="Arial" w:eastAsia="Arial" w:hAnsi="Arial"/>
-                <w:b w:val="false"/>
-                <w:bCs w:val="false"/>
-                <w:sz w:val="20"/>
-                <w:szCs w:val="20"/>
-              </w:rPr>
-              <w:t xml:space="preserve">1</w:t>
-            </w:r>
-          </w:p>
-        </w:tc>
-        <w:tc>
-          <w:tcPr>
-            <w:tcW w:type="dxa" w:w="700"/>
+            <w:tcW w:type="dxa" w:w="1500"/>
             <w:tcMar>
               <w:top w:type="dxa" w:w="40"/>
               <w:left w:type="dxa" w:w="80"/>
@@ -2271,7 +2614,7 @@
         </w:tc>
         <w:tc>
           <w:tcPr>
-            <w:tcW w:type="dxa" w:w="700"/>
+            <w:tcW w:type="dxa" w:w="1300"/>
             <w:tcMar>
               <w:top w:type="dxa" w:w="40"/>
               <w:left w:type="dxa" w:w="80"/>
@@ -2299,29 +2642,29 @@
         </w:tc>
         <w:tc>
           <w:tcPr>
-            <w:tcW w:type="dxa" w:w="3900"/>
-            <w:tcMar>
-              <w:top w:type="dxa" w:w="40"/>
-              <w:left w:type="dxa" w:w="80"/>
-              <w:bottom w:type="dxa" w:w="40"/>
-              <w:right w:type="dxa" w:w="80"/>
-            </w:tcMar>
-            <w:vAlign w:val="center"/>
-          </w:tcPr>
-          <w:p>
-            <w:pPr>
-              <w:spacing w:after="30" w:before="30" w:line="240" w:lineRule="auto"/>
-              <w:jc w:val="left"/>
-            </w:pPr>
-            <w:r>
-              <w:rPr>
-                <w:rFonts w:ascii="Arial" w:cs="Arial" w:eastAsia="Arial" w:hAnsi="Arial"/>
-                <w:b w:val="false"/>
-                <w:bCs w:val="false"/>
-                <w:sz w:val="20"/>
-                <w:szCs w:val="20"/>
-              </w:rPr>
-              <w:t xml:space="preserve">La puerta permanece cerrada</w:t>
+            <w:tcW w:type="dxa" w:w="750"/>
+            <w:tcMar>
+              <w:top w:type="dxa" w:w="40"/>
+              <w:left w:type="dxa" w:w="80"/>
+              <w:bottom w:type="dxa" w:w="40"/>
+              <w:right w:type="dxa" w:w="80"/>
+            </w:tcMar>
+            <w:vAlign w:val="center"/>
+          </w:tcPr>
+          <w:p>
+            <w:pPr>
+              <w:spacing w:after="30" w:before="30" w:line="240" w:lineRule="auto"/>
+              <w:jc w:val="center"/>
+            </w:pPr>
+            <w:r>
+              <w:rPr>
+                <w:rFonts w:ascii="Arial" w:cs="Arial" w:eastAsia="Arial" w:hAnsi="Arial"/>
+                <w:b w:val="false"/>
+                <w:bCs w:val="false"/>
+                <w:sz w:val="20"/>
+                <w:szCs w:val="20"/>
+              </w:rPr>
+              <w:t xml:space="preserve">0</w:t>
             </w:r>
           </w:p>
         </w:tc>
@@ -2332,6 +2675,90 @@
         </w:trPr>
         <w:tc>
           <w:tcPr>
+            <w:tcW w:type="dxa" w:w="650"/>
+            <w:tcMar>
+              <w:top w:type="dxa" w:w="40"/>
+              <w:left w:type="dxa" w:w="80"/>
+              <w:bottom w:type="dxa" w:w="40"/>
+              <w:right w:type="dxa" w:w="80"/>
+            </w:tcMar>
+            <w:vAlign w:val="center"/>
+          </w:tcPr>
+          <w:p>
+            <w:pPr>
+              <w:spacing w:after="30" w:before="30" w:line="240" w:lineRule="auto"/>
+              <w:jc w:val="center"/>
+            </w:pPr>
+            <w:r>
+              <w:rPr>
+                <w:rFonts w:ascii="Arial" w:cs="Arial" w:eastAsia="Arial" w:hAnsi="Arial"/>
+                <w:b w:val="false"/>
+                <w:bCs w:val="false"/>
+                <w:sz w:val="20"/>
+                <w:szCs w:val="20"/>
+              </w:rPr>
+              <w:t xml:space="preserve">0</w:t>
+            </w:r>
+          </w:p>
+        </w:tc>
+        <w:tc>
+          <w:tcPr>
+            <w:tcW w:type="dxa" w:w="650"/>
+            <w:tcMar>
+              <w:top w:type="dxa" w:w="40"/>
+              <w:left w:type="dxa" w:w="80"/>
+              <w:bottom w:type="dxa" w:w="40"/>
+              <w:right w:type="dxa" w:w="80"/>
+            </w:tcMar>
+            <w:vAlign w:val="center"/>
+          </w:tcPr>
+          <w:p>
+            <w:pPr>
+              <w:spacing w:after="30" w:before="30" w:line="240" w:lineRule="auto"/>
+              <w:jc w:val="center"/>
+            </w:pPr>
+            <w:r>
+              <w:rPr>
+                <w:rFonts w:ascii="Arial" w:cs="Arial" w:eastAsia="Arial" w:hAnsi="Arial"/>
+                <w:b w:val="false"/>
+                <w:bCs w:val="false"/>
+                <w:sz w:val="20"/>
+                <w:szCs w:val="20"/>
+              </w:rPr>
+              <w:t xml:space="preserve">1</w:t>
+            </w:r>
+          </w:p>
+        </w:tc>
+        <w:tc>
+          <w:tcPr>
+            <w:tcW w:type="dxa" w:w="650"/>
+            <w:tcMar>
+              <w:top w:type="dxa" w:w="40"/>
+              <w:left w:type="dxa" w:w="80"/>
+              <w:bottom w:type="dxa" w:w="40"/>
+              <w:right w:type="dxa" w:w="80"/>
+            </w:tcMar>
+            <w:vAlign w:val="center"/>
+          </w:tcPr>
+          <w:p>
+            <w:pPr>
+              <w:spacing w:after="30" w:before="30" w:line="240" w:lineRule="auto"/>
+              <w:jc w:val="center"/>
+            </w:pPr>
+            <w:r>
+              <w:rPr>
+                <w:rFonts w:ascii="Arial" w:cs="Arial" w:eastAsia="Arial" w:hAnsi="Arial"/>
+                <w:b w:val="false"/>
+                <w:bCs w:val="false"/>
+                <w:sz w:val="20"/>
+                <w:szCs w:val="20"/>
+              </w:rPr>
+              <w:t xml:space="preserve">1</w:t>
+            </w:r>
+          </w:p>
+        </w:tc>
+        <w:tc>
+          <w:tcPr>
             <w:tcW w:type="dxa" w:w="700"/>
             <w:tcMar>
               <w:top w:type="dxa" w:w="40"/>
@@ -2354,69 +2781,41 @@
                 <w:sz w:val="20"/>
                 <w:szCs w:val="20"/>
               </w:rPr>
+              <w:t xml:space="preserve">1</w:t>
+            </w:r>
+          </w:p>
+        </w:tc>
+        <w:tc>
+          <w:tcPr>
+            <w:tcW w:type="dxa" w:w="700"/>
+            <w:tcMar>
+              <w:top w:type="dxa" w:w="40"/>
+              <w:left w:type="dxa" w:w="80"/>
+              <w:bottom w:type="dxa" w:w="40"/>
+              <w:right w:type="dxa" w:w="80"/>
+            </w:tcMar>
+            <w:vAlign w:val="center"/>
+          </w:tcPr>
+          <w:p>
+            <w:pPr>
+              <w:spacing w:after="30" w:before="30" w:line="240" w:lineRule="auto"/>
+              <w:jc w:val="center"/>
+            </w:pPr>
+            <w:r>
+              <w:rPr>
+                <w:rFonts w:ascii="Arial" w:cs="Arial" w:eastAsia="Arial" w:hAnsi="Arial"/>
+                <w:b w:val="false"/>
+                <w:bCs w:val="false"/>
+                <w:sz w:val="20"/>
+                <w:szCs w:val="20"/>
+              </w:rPr>
               <w:t xml:space="preserve">0</w:t>
             </w:r>
           </w:p>
         </w:tc>
         <w:tc>
           <w:tcPr>
-            <w:tcW w:type="dxa" w:w="700"/>
-            <w:tcMar>
-              <w:top w:type="dxa" w:w="40"/>
-              <w:left w:type="dxa" w:w="80"/>
-              <w:bottom w:type="dxa" w:w="40"/>
-              <w:right w:type="dxa" w:w="80"/>
-            </w:tcMar>
-            <w:vAlign w:val="center"/>
-          </w:tcPr>
-          <w:p>
-            <w:pPr>
-              <w:spacing w:after="30" w:before="30" w:line="240" w:lineRule="auto"/>
-              <w:jc w:val="center"/>
-            </w:pPr>
-            <w:r>
-              <w:rPr>
-                <w:rFonts w:ascii="Arial" w:cs="Arial" w:eastAsia="Arial" w:hAnsi="Arial"/>
-                <w:b w:val="false"/>
-                <w:bCs w:val="false"/>
-                <w:sz w:val="20"/>
-                <w:szCs w:val="20"/>
-              </w:rPr>
-              <w:t xml:space="preserve">1</w:t>
-            </w:r>
-          </w:p>
-        </w:tc>
-        <w:tc>
-          <w:tcPr>
-            <w:tcW w:type="dxa" w:w="700"/>
-            <w:tcMar>
-              <w:top w:type="dxa" w:w="40"/>
-              <w:left w:type="dxa" w:w="80"/>
-              <w:bottom w:type="dxa" w:w="40"/>
-              <w:right w:type="dxa" w:w="80"/>
-            </w:tcMar>
-            <w:vAlign w:val="center"/>
-          </w:tcPr>
-          <w:p>
-            <w:pPr>
-              <w:spacing w:after="30" w:before="30" w:line="240" w:lineRule="auto"/>
-              <w:jc w:val="center"/>
-            </w:pPr>
-            <w:r>
-              <w:rPr>
-                <w:rFonts w:ascii="Arial" w:cs="Arial" w:eastAsia="Arial" w:hAnsi="Arial"/>
-                <w:b w:val="false"/>
-                <w:bCs w:val="false"/>
-                <w:sz w:val="20"/>
-                <w:szCs w:val="20"/>
-              </w:rPr>
-              <w:t xml:space="preserve">1</w:t>
-            </w:r>
-          </w:p>
-        </w:tc>
-        <w:tc>
-          <w:tcPr>
-            <w:tcW w:type="dxa" w:w="700"/>
+            <w:tcW w:type="dxa" w:w="1500"/>
             <w:tcMar>
               <w:top w:type="dxa" w:w="40"/>
               <w:left w:type="dxa" w:w="80"/>
@@ -2444,29 +2843,57 @@
         </w:tc>
         <w:tc>
           <w:tcPr>
-            <w:tcW w:type="dxa" w:w="3900"/>
-            <w:tcMar>
-              <w:top w:type="dxa" w:w="40"/>
-              <w:left w:type="dxa" w:w="80"/>
-              <w:bottom w:type="dxa" w:w="40"/>
-              <w:right w:type="dxa" w:w="80"/>
-            </w:tcMar>
-            <w:vAlign w:val="center"/>
-          </w:tcPr>
-          <w:p>
-            <w:pPr>
-              <w:spacing w:after="30" w:before="30" w:line="240" w:lineRule="auto"/>
-              <w:jc w:val="left"/>
-            </w:pPr>
-            <w:r>
-              <w:rPr>
-                <w:rFonts w:ascii="Arial" w:cs="Arial" w:eastAsia="Arial" w:hAnsi="Arial"/>
-                <w:b w:val="false"/>
-                <w:bCs w:val="false"/>
-                <w:sz w:val="20"/>
-                <w:szCs w:val="20"/>
-              </w:rPr>
-              <w:t xml:space="preserve">La puerta permanece cerrada</w:t>
+            <w:tcW w:type="dxa" w:w="1300"/>
+            <w:tcMar>
+              <w:top w:type="dxa" w:w="40"/>
+              <w:left w:type="dxa" w:w="80"/>
+              <w:bottom w:type="dxa" w:w="40"/>
+              <w:right w:type="dxa" w:w="80"/>
+            </w:tcMar>
+            <w:vAlign w:val="center"/>
+          </w:tcPr>
+          <w:p>
+            <w:pPr>
+              <w:spacing w:after="30" w:before="30" w:line="240" w:lineRule="auto"/>
+              <w:jc w:val="center"/>
+            </w:pPr>
+            <w:r>
+              <w:rPr>
+                <w:rFonts w:ascii="Arial" w:cs="Arial" w:eastAsia="Arial" w:hAnsi="Arial"/>
+                <w:b w:val="false"/>
+                <w:bCs w:val="false"/>
+                <w:sz w:val="20"/>
+                <w:szCs w:val="20"/>
+              </w:rPr>
+              <w:t xml:space="preserve">0</w:t>
+            </w:r>
+          </w:p>
+        </w:tc>
+        <w:tc>
+          <w:tcPr>
+            <w:tcW w:type="dxa" w:w="750"/>
+            <w:tcMar>
+              <w:top w:type="dxa" w:w="40"/>
+              <w:left w:type="dxa" w:w="80"/>
+              <w:bottom w:type="dxa" w:w="40"/>
+              <w:right w:type="dxa" w:w="80"/>
+            </w:tcMar>
+            <w:vAlign w:val="center"/>
+          </w:tcPr>
+          <w:p>
+            <w:pPr>
+              <w:spacing w:after="30" w:before="30" w:line="240" w:lineRule="auto"/>
+              <w:jc w:val="center"/>
+            </w:pPr>
+            <w:r>
+              <w:rPr>
+                <w:rFonts w:ascii="Arial" w:cs="Arial" w:eastAsia="Arial" w:hAnsi="Arial"/>
+                <w:b w:val="false"/>
+                <w:bCs w:val="false"/>
+                <w:sz w:val="20"/>
+                <w:szCs w:val="20"/>
+              </w:rPr>
+              <w:t xml:space="preserve">0</w:t>
             </w:r>
           </w:p>
         </w:tc>
@@ -2477,6 +2904,90 @@
         </w:trPr>
         <w:tc>
           <w:tcPr>
+            <w:tcW w:type="dxa" w:w="650"/>
+            <w:tcMar>
+              <w:top w:type="dxa" w:w="40"/>
+              <w:left w:type="dxa" w:w="80"/>
+              <w:bottom w:type="dxa" w:w="40"/>
+              <w:right w:type="dxa" w:w="80"/>
+            </w:tcMar>
+            <w:vAlign w:val="center"/>
+          </w:tcPr>
+          <w:p>
+            <w:pPr>
+              <w:spacing w:after="30" w:before="30" w:line="240" w:lineRule="auto"/>
+              <w:jc w:val="center"/>
+            </w:pPr>
+            <w:r>
+              <w:rPr>
+                <w:rFonts w:ascii="Arial" w:cs="Arial" w:eastAsia="Arial" w:hAnsi="Arial"/>
+                <w:b w:val="false"/>
+                <w:bCs w:val="false"/>
+                <w:sz w:val="20"/>
+                <w:szCs w:val="20"/>
+              </w:rPr>
+              <w:t xml:space="preserve">1</w:t>
+            </w:r>
+          </w:p>
+        </w:tc>
+        <w:tc>
+          <w:tcPr>
+            <w:tcW w:type="dxa" w:w="650"/>
+            <w:tcMar>
+              <w:top w:type="dxa" w:w="40"/>
+              <w:left w:type="dxa" w:w="80"/>
+              <w:bottom w:type="dxa" w:w="40"/>
+              <w:right w:type="dxa" w:w="80"/>
+            </w:tcMar>
+            <w:vAlign w:val="center"/>
+          </w:tcPr>
+          <w:p>
+            <w:pPr>
+              <w:spacing w:after="30" w:before="30" w:line="240" w:lineRule="auto"/>
+              <w:jc w:val="center"/>
+            </w:pPr>
+            <w:r>
+              <w:rPr>
+                <w:rFonts w:ascii="Arial" w:cs="Arial" w:eastAsia="Arial" w:hAnsi="Arial"/>
+                <w:b w:val="false"/>
+                <w:bCs w:val="false"/>
+                <w:sz w:val="20"/>
+                <w:szCs w:val="20"/>
+              </w:rPr>
+              <w:t xml:space="preserve">0</w:t>
+            </w:r>
+          </w:p>
+        </w:tc>
+        <w:tc>
+          <w:tcPr>
+            <w:tcW w:type="dxa" w:w="650"/>
+            <w:tcMar>
+              <w:top w:type="dxa" w:w="40"/>
+              <w:left w:type="dxa" w:w="80"/>
+              <w:bottom w:type="dxa" w:w="40"/>
+              <w:right w:type="dxa" w:w="80"/>
+            </w:tcMar>
+            <w:vAlign w:val="center"/>
+          </w:tcPr>
+          <w:p>
+            <w:pPr>
+              <w:spacing w:after="30" w:before="30" w:line="240" w:lineRule="auto"/>
+              <w:jc w:val="center"/>
+            </w:pPr>
+            <w:r>
+              <w:rPr>
+                <w:rFonts w:ascii="Arial" w:cs="Arial" w:eastAsia="Arial" w:hAnsi="Arial"/>
+                <w:b w:val="false"/>
+                <w:bCs w:val="false"/>
+                <w:sz w:val="20"/>
+                <w:szCs w:val="20"/>
+              </w:rPr>
+              <w:t xml:space="preserve">0</w:t>
+            </w:r>
+          </w:p>
+        </w:tc>
+        <w:tc>
+          <w:tcPr>
             <w:tcW w:type="dxa" w:w="700"/>
             <w:tcMar>
               <w:top w:type="dxa" w:w="40"/>
@@ -2499,13 +3010,41 @@
                 <w:sz w:val="20"/>
                 <w:szCs w:val="20"/>
               </w:rPr>
+              <w:t xml:space="preserve">0</w:t>
+            </w:r>
+          </w:p>
+        </w:tc>
+        <w:tc>
+          <w:tcPr>
+            <w:tcW w:type="dxa" w:w="700"/>
+            <w:tcMar>
+              <w:top w:type="dxa" w:w="40"/>
+              <w:left w:type="dxa" w:w="80"/>
+              <w:bottom w:type="dxa" w:w="40"/>
+              <w:right w:type="dxa" w:w="80"/>
+            </w:tcMar>
+            <w:vAlign w:val="center"/>
+          </w:tcPr>
+          <w:p>
+            <w:pPr>
+              <w:spacing w:after="30" w:before="30" w:line="240" w:lineRule="auto"/>
+              <w:jc w:val="center"/>
+            </w:pPr>
+            <w:r>
+              <w:rPr>
+                <w:rFonts w:ascii="Arial" w:cs="Arial" w:eastAsia="Arial" w:hAnsi="Arial"/>
+                <w:b w:val="false"/>
+                <w:bCs w:val="false"/>
+                <w:sz w:val="20"/>
+                <w:szCs w:val="20"/>
+              </w:rPr>
               <w:t xml:space="preserve">1</w:t>
             </w:r>
           </w:p>
         </w:tc>
         <w:tc>
           <w:tcPr>
-            <w:tcW w:type="dxa" w:w="700"/>
+            <w:tcW w:type="dxa" w:w="1500"/>
             <w:tcMar>
               <w:top w:type="dxa" w:w="40"/>
               <w:left w:type="dxa" w:w="80"/>
@@ -2533,7 +3072,7 @@
         </w:tc>
         <w:tc>
           <w:tcPr>
-            <w:tcW w:type="dxa" w:w="700"/>
+            <w:tcW w:type="dxa" w:w="1300"/>
             <w:tcMar>
               <w:top w:type="dxa" w:w="40"/>
               <w:left w:type="dxa" w:w="80"/>
@@ -2561,7 +3100,7 @@
         </w:tc>
         <w:tc>
           <w:tcPr>
-            <w:tcW w:type="dxa" w:w="700"/>
+            <w:tcW w:type="dxa" w:w="750"/>
             <w:tcMar>
               <w:top w:type="dxa" w:w="40"/>
               <w:left w:type="dxa" w:w="80"/>
@@ -2584,34 +3123,6 @@
                 <w:szCs w:val="20"/>
               </w:rPr>
               <w:t xml:space="preserve">0</w:t>
-            </w:r>
-          </w:p>
-        </w:tc>
-        <w:tc>
-          <w:tcPr>
-            <w:tcW w:type="dxa" w:w="3900"/>
-            <w:tcMar>
-              <w:top w:type="dxa" w:w="40"/>
-              <w:left w:type="dxa" w:w="80"/>
-              <w:bottom w:type="dxa" w:w="40"/>
-              <w:right w:type="dxa" w:w="80"/>
-            </w:tcMar>
-            <w:vAlign w:val="center"/>
-          </w:tcPr>
-          <w:p>
-            <w:pPr>
-              <w:spacing w:after="30" w:before="30" w:line="240" w:lineRule="auto"/>
-              <w:jc w:val="left"/>
-            </w:pPr>
-            <w:r>
-              <w:rPr>
-                <w:rFonts w:ascii="Arial" w:cs="Arial" w:eastAsia="Arial" w:hAnsi="Arial"/>
-                <w:b w:val="false"/>
-                <w:bCs w:val="false"/>
-                <w:sz w:val="20"/>
-                <w:szCs w:val="20"/>
-              </w:rPr>
-              <w:t xml:space="preserve">La puerta permanece cerrada</w:t>
             </w:r>
           </w:p>
         </w:tc>
@@ -2622,6 +3133,90 @@
         </w:trPr>
         <w:tc>
           <w:tcPr>
+            <w:tcW w:type="dxa" w:w="650"/>
+            <w:tcMar>
+              <w:top w:type="dxa" w:w="40"/>
+              <w:left w:type="dxa" w:w="80"/>
+              <w:bottom w:type="dxa" w:w="40"/>
+              <w:right w:type="dxa" w:w="80"/>
+            </w:tcMar>
+            <w:vAlign w:val="center"/>
+          </w:tcPr>
+          <w:p>
+            <w:pPr>
+              <w:spacing w:after="30" w:before="30" w:line="240" w:lineRule="auto"/>
+              <w:jc w:val="center"/>
+            </w:pPr>
+            <w:r>
+              <w:rPr>
+                <w:rFonts w:ascii="Arial" w:cs="Arial" w:eastAsia="Arial" w:hAnsi="Arial"/>
+                <w:b w:val="false"/>
+                <w:bCs w:val="false"/>
+                <w:sz w:val="20"/>
+                <w:szCs w:val="20"/>
+              </w:rPr>
+              <w:t xml:space="preserve">1</w:t>
+            </w:r>
+          </w:p>
+        </w:tc>
+        <w:tc>
+          <w:tcPr>
+            <w:tcW w:type="dxa" w:w="650"/>
+            <w:tcMar>
+              <w:top w:type="dxa" w:w="40"/>
+              <w:left w:type="dxa" w:w="80"/>
+              <w:bottom w:type="dxa" w:w="40"/>
+              <w:right w:type="dxa" w:w="80"/>
+            </w:tcMar>
+            <w:vAlign w:val="center"/>
+          </w:tcPr>
+          <w:p>
+            <w:pPr>
+              <w:spacing w:after="30" w:before="30" w:line="240" w:lineRule="auto"/>
+              <w:jc w:val="center"/>
+            </w:pPr>
+            <w:r>
+              <w:rPr>
+                <w:rFonts w:ascii="Arial" w:cs="Arial" w:eastAsia="Arial" w:hAnsi="Arial"/>
+                <w:b w:val="false"/>
+                <w:bCs w:val="false"/>
+                <w:sz w:val="20"/>
+                <w:szCs w:val="20"/>
+              </w:rPr>
+              <w:t xml:space="preserve">0</w:t>
+            </w:r>
+          </w:p>
+        </w:tc>
+        <w:tc>
+          <w:tcPr>
+            <w:tcW w:type="dxa" w:w="650"/>
+            <w:tcMar>
+              <w:top w:type="dxa" w:w="40"/>
+              <w:left w:type="dxa" w:w="80"/>
+              <w:bottom w:type="dxa" w:w="40"/>
+              <w:right w:type="dxa" w:w="80"/>
+            </w:tcMar>
+            <w:vAlign w:val="center"/>
+          </w:tcPr>
+          <w:p>
+            <w:pPr>
+              <w:spacing w:after="30" w:before="30" w:line="240" w:lineRule="auto"/>
+              <w:jc w:val="center"/>
+            </w:pPr>
+            <w:r>
+              <w:rPr>
+                <w:rFonts w:ascii="Arial" w:cs="Arial" w:eastAsia="Arial" w:hAnsi="Arial"/>
+                <w:b w:val="false"/>
+                <w:bCs w:val="false"/>
+                <w:sz w:val="20"/>
+                <w:szCs w:val="20"/>
+              </w:rPr>
+              <w:t xml:space="preserve">1</w:t>
+            </w:r>
+          </w:p>
+        </w:tc>
+        <w:tc>
+          <w:tcPr>
             <w:tcW w:type="dxa" w:w="700"/>
             <w:tcMar>
               <w:top w:type="dxa" w:w="40"/>
@@ -2644,13 +3239,41 @@
                 <w:sz w:val="20"/>
                 <w:szCs w:val="20"/>
               </w:rPr>
+              <w:t xml:space="preserve">0</w:t>
+            </w:r>
+          </w:p>
+        </w:tc>
+        <w:tc>
+          <w:tcPr>
+            <w:tcW w:type="dxa" w:w="700"/>
+            <w:tcMar>
+              <w:top w:type="dxa" w:w="40"/>
+              <w:left w:type="dxa" w:w="80"/>
+              <w:bottom w:type="dxa" w:w="40"/>
+              <w:right w:type="dxa" w:w="80"/>
+            </w:tcMar>
+            <w:vAlign w:val="center"/>
+          </w:tcPr>
+          <w:p>
+            <w:pPr>
+              <w:spacing w:after="30" w:before="30" w:line="240" w:lineRule="auto"/>
+              <w:jc w:val="center"/>
+            </w:pPr>
+            <w:r>
+              <w:rPr>
+                <w:rFonts w:ascii="Arial" w:cs="Arial" w:eastAsia="Arial" w:hAnsi="Arial"/>
+                <w:b w:val="false"/>
+                <w:bCs w:val="false"/>
+                <w:sz w:val="20"/>
+                <w:szCs w:val="20"/>
+              </w:rPr>
               <w:t xml:space="preserve">1</w:t>
             </w:r>
           </w:p>
         </w:tc>
         <w:tc>
           <w:tcPr>
-            <w:tcW w:type="dxa" w:w="700"/>
+            <w:tcW w:type="dxa" w:w="1500"/>
             <w:tcMar>
               <w:top w:type="dxa" w:w="40"/>
               <w:left w:type="dxa" w:w="80"/>
@@ -2678,35 +3301,7 @@
         </w:tc>
         <w:tc>
           <w:tcPr>
-            <w:tcW w:type="dxa" w:w="700"/>
-            <w:tcMar>
-              <w:top w:type="dxa" w:w="40"/>
-              <w:left w:type="dxa" w:w="80"/>
-              <w:bottom w:type="dxa" w:w="40"/>
-              <w:right w:type="dxa" w:w="80"/>
-            </w:tcMar>
-            <w:vAlign w:val="center"/>
-          </w:tcPr>
-          <w:p>
-            <w:pPr>
-              <w:spacing w:after="30" w:before="30" w:line="240" w:lineRule="auto"/>
-              <w:jc w:val="center"/>
-            </w:pPr>
-            <w:r>
-              <w:rPr>
-                <w:rFonts w:ascii="Arial" w:cs="Arial" w:eastAsia="Arial" w:hAnsi="Arial"/>
-                <w:b w:val="false"/>
-                <w:bCs w:val="false"/>
-                <w:sz w:val="20"/>
-                <w:szCs w:val="20"/>
-              </w:rPr>
-              <w:t xml:space="preserve">1</w:t>
-            </w:r>
-          </w:p>
-        </w:tc>
-        <w:tc>
-          <w:tcPr>
-            <w:tcW w:type="dxa" w:w="700"/>
+            <w:tcW w:type="dxa" w:w="1300"/>
             <w:tcMar>
               <w:top w:type="dxa" w:w="40"/>
               <w:left w:type="dxa" w:w="80"/>
@@ -2734,29 +3329,29 @@
         </w:tc>
         <w:tc>
           <w:tcPr>
-            <w:tcW w:type="dxa" w:w="3900"/>
-            <w:tcMar>
-              <w:top w:type="dxa" w:w="40"/>
-              <w:left w:type="dxa" w:w="80"/>
-              <w:bottom w:type="dxa" w:w="40"/>
-              <w:right w:type="dxa" w:w="80"/>
-            </w:tcMar>
-            <w:vAlign w:val="center"/>
-          </w:tcPr>
-          <w:p>
-            <w:pPr>
-              <w:spacing w:after="30" w:before="30" w:line="240" w:lineRule="auto"/>
-              <w:jc w:val="left"/>
-            </w:pPr>
-            <w:r>
-              <w:rPr>
-                <w:rFonts w:ascii="Arial" w:cs="Arial" w:eastAsia="Arial" w:hAnsi="Arial"/>
-                <w:b w:val="false"/>
-                <w:bCs w:val="false"/>
-                <w:sz w:val="20"/>
-                <w:szCs w:val="20"/>
-              </w:rPr>
-              <w:t xml:space="preserve">La puerta permanece cerrada</w:t>
+            <w:tcW w:type="dxa" w:w="750"/>
+            <w:tcMar>
+              <w:top w:type="dxa" w:w="40"/>
+              <w:left w:type="dxa" w:w="80"/>
+              <w:bottom w:type="dxa" w:w="40"/>
+              <w:right w:type="dxa" w:w="80"/>
+            </w:tcMar>
+            <w:vAlign w:val="center"/>
+          </w:tcPr>
+          <w:p>
+            <w:pPr>
+              <w:spacing w:after="30" w:before="30" w:line="240" w:lineRule="auto"/>
+              <w:jc w:val="center"/>
+            </w:pPr>
+            <w:r>
+              <w:rPr>
+                <w:rFonts w:ascii="Arial" w:cs="Arial" w:eastAsia="Arial" w:hAnsi="Arial"/>
+                <w:b w:val="false"/>
+                <w:bCs w:val="false"/>
+                <w:sz w:val="20"/>
+                <w:szCs w:val="20"/>
+              </w:rPr>
+              <w:t xml:space="preserve">0</w:t>
             </w:r>
           </w:p>
         </w:tc>
@@ -2767,6 +3362,90 @@
         </w:trPr>
         <w:tc>
           <w:tcPr>
+            <w:tcW w:type="dxa" w:w="650"/>
+            <w:tcMar>
+              <w:top w:type="dxa" w:w="40"/>
+              <w:left w:type="dxa" w:w="80"/>
+              <w:bottom w:type="dxa" w:w="40"/>
+              <w:right w:type="dxa" w:w="80"/>
+            </w:tcMar>
+            <w:vAlign w:val="center"/>
+          </w:tcPr>
+          <w:p>
+            <w:pPr>
+              <w:spacing w:after="30" w:before="30" w:line="240" w:lineRule="auto"/>
+              <w:jc w:val="center"/>
+            </w:pPr>
+            <w:r>
+              <w:rPr>
+                <w:rFonts w:ascii="Arial" w:cs="Arial" w:eastAsia="Arial" w:hAnsi="Arial"/>
+                <w:b w:val="false"/>
+                <w:bCs w:val="false"/>
+                <w:sz w:val="20"/>
+                <w:szCs w:val="20"/>
+              </w:rPr>
+              <w:t xml:space="preserve">1</w:t>
+            </w:r>
+          </w:p>
+        </w:tc>
+        <w:tc>
+          <w:tcPr>
+            <w:tcW w:type="dxa" w:w="650"/>
+            <w:tcMar>
+              <w:top w:type="dxa" w:w="40"/>
+              <w:left w:type="dxa" w:w="80"/>
+              <w:bottom w:type="dxa" w:w="40"/>
+              <w:right w:type="dxa" w:w="80"/>
+            </w:tcMar>
+            <w:vAlign w:val="center"/>
+          </w:tcPr>
+          <w:p>
+            <w:pPr>
+              <w:spacing w:after="30" w:before="30" w:line="240" w:lineRule="auto"/>
+              <w:jc w:val="center"/>
+            </w:pPr>
+            <w:r>
+              <w:rPr>
+                <w:rFonts w:ascii="Arial" w:cs="Arial" w:eastAsia="Arial" w:hAnsi="Arial"/>
+                <w:b w:val="false"/>
+                <w:bCs w:val="false"/>
+                <w:sz w:val="20"/>
+                <w:szCs w:val="20"/>
+              </w:rPr>
+              <w:t xml:space="preserve">1</w:t>
+            </w:r>
+          </w:p>
+        </w:tc>
+        <w:tc>
+          <w:tcPr>
+            <w:tcW w:type="dxa" w:w="650"/>
+            <w:tcMar>
+              <w:top w:type="dxa" w:w="40"/>
+              <w:left w:type="dxa" w:w="80"/>
+              <w:bottom w:type="dxa" w:w="40"/>
+              <w:right w:type="dxa" w:w="80"/>
+            </w:tcMar>
+            <w:vAlign w:val="center"/>
+          </w:tcPr>
+          <w:p>
+            <w:pPr>
+              <w:spacing w:after="30" w:before="30" w:line="240" w:lineRule="auto"/>
+              <w:jc w:val="center"/>
+            </w:pPr>
+            <w:r>
+              <w:rPr>
+                <w:rFonts w:ascii="Arial" w:cs="Arial" w:eastAsia="Arial" w:hAnsi="Arial"/>
+                <w:b w:val="false"/>
+                <w:bCs w:val="false"/>
+                <w:sz w:val="20"/>
+                <w:szCs w:val="20"/>
+              </w:rPr>
+              <w:t xml:space="preserve">0</w:t>
+            </w:r>
+          </w:p>
+        </w:tc>
+        <w:tc>
+          <w:tcPr>
             <w:tcW w:type="dxa" w:w="700"/>
             <w:tcMar>
               <w:top w:type="dxa" w:w="40"/>
@@ -2789,7 +3468,7 @@
                 <w:sz w:val="20"/>
                 <w:szCs w:val="20"/>
               </w:rPr>
-              <w:t xml:space="preserve">1</w:t>
+              <w:t xml:space="preserve">0</w:t>
             </w:r>
           </w:p>
         </w:tc>
@@ -2817,41 +3496,13 @@
                 <w:sz w:val="20"/>
                 <w:szCs w:val="20"/>
               </w:rPr>
-              <w:t xml:space="preserve">1</w:t>
-            </w:r>
-          </w:p>
-        </w:tc>
-        <w:tc>
-          <w:tcPr>
-            <w:tcW w:type="dxa" w:w="700"/>
-            <w:tcMar>
-              <w:top w:type="dxa" w:w="40"/>
-              <w:left w:type="dxa" w:w="80"/>
-              <w:bottom w:type="dxa" w:w="40"/>
-              <w:right w:type="dxa" w:w="80"/>
-            </w:tcMar>
-            <w:vAlign w:val="center"/>
-          </w:tcPr>
-          <w:p>
-            <w:pPr>
-              <w:spacing w:after="30" w:before="30" w:line="240" w:lineRule="auto"/>
-              <w:jc w:val="center"/>
-            </w:pPr>
-            <w:r>
-              <w:rPr>
-                <w:rFonts w:ascii="Arial" w:cs="Arial" w:eastAsia="Arial" w:hAnsi="Arial"/>
-                <w:b w:val="false"/>
-                <w:bCs w:val="false"/>
-                <w:sz w:val="20"/>
-                <w:szCs w:val="20"/>
-              </w:rPr>
               <w:t xml:space="preserve">0</w:t>
             </w:r>
           </w:p>
         </w:tc>
         <w:tc>
           <w:tcPr>
-            <w:tcW w:type="dxa" w:w="700"/>
+            <w:tcW w:type="dxa" w:w="1500"/>
             <w:tcMar>
               <w:top w:type="dxa" w:w="40"/>
               <w:left w:type="dxa" w:w="80"/>
@@ -2879,29 +3530,57 @@
         </w:tc>
         <w:tc>
           <w:tcPr>
-            <w:tcW w:type="dxa" w:w="3900"/>
-            <w:tcMar>
-              <w:top w:type="dxa" w:w="40"/>
-              <w:left w:type="dxa" w:w="80"/>
-              <w:bottom w:type="dxa" w:w="40"/>
-              <w:right w:type="dxa" w:w="80"/>
-            </w:tcMar>
-            <w:vAlign w:val="center"/>
-          </w:tcPr>
-          <w:p>
-            <w:pPr>
-              <w:spacing w:after="30" w:before="30" w:line="240" w:lineRule="auto"/>
-              <w:jc w:val="left"/>
-            </w:pPr>
-            <w:r>
-              <w:rPr>
-                <w:rFonts w:ascii="Arial" w:cs="Arial" w:eastAsia="Arial" w:hAnsi="Arial"/>
-                <w:b w:val="false"/>
-                <w:bCs w:val="false"/>
-                <w:sz w:val="20"/>
-                <w:szCs w:val="20"/>
-              </w:rPr>
-              <w:t xml:space="preserve">La puerta permanece cerrada</w:t>
+            <w:tcW w:type="dxa" w:w="1300"/>
+            <w:tcMar>
+              <w:top w:type="dxa" w:w="40"/>
+              <w:left w:type="dxa" w:w="80"/>
+              <w:bottom w:type="dxa" w:w="40"/>
+              <w:right w:type="dxa" w:w="80"/>
+            </w:tcMar>
+            <w:vAlign w:val="center"/>
+          </w:tcPr>
+          <w:p>
+            <w:pPr>
+              <w:spacing w:after="30" w:before="30" w:line="240" w:lineRule="auto"/>
+              <w:jc w:val="center"/>
+            </w:pPr>
+            <w:r>
+              <w:rPr>
+                <w:rFonts w:ascii="Arial" w:cs="Arial" w:eastAsia="Arial" w:hAnsi="Arial"/>
+                <w:b w:val="false"/>
+                <w:bCs w:val="false"/>
+                <w:sz w:val="20"/>
+                <w:szCs w:val="20"/>
+              </w:rPr>
+              <w:t xml:space="preserve">0</w:t>
+            </w:r>
+          </w:p>
+        </w:tc>
+        <w:tc>
+          <w:tcPr>
+            <w:tcW w:type="dxa" w:w="750"/>
+            <w:tcMar>
+              <w:top w:type="dxa" w:w="40"/>
+              <w:left w:type="dxa" w:w="80"/>
+              <w:bottom w:type="dxa" w:w="40"/>
+              <w:right w:type="dxa" w:w="80"/>
+            </w:tcMar>
+            <w:vAlign w:val="center"/>
+          </w:tcPr>
+          <w:p>
+            <w:pPr>
+              <w:spacing w:after="30" w:before="30" w:line="240" w:lineRule="auto"/>
+              <w:jc w:val="center"/>
+            </w:pPr>
+            <w:r>
+              <w:rPr>
+                <w:rFonts w:ascii="Arial" w:cs="Arial" w:eastAsia="Arial" w:hAnsi="Arial"/>
+                <w:b w:val="false"/>
+                <w:bCs w:val="false"/>
+                <w:sz w:val="20"/>
+                <w:szCs w:val="20"/>
+              </w:rPr>
+              <w:t xml:space="preserve">0</w:t>
             </w:r>
           </w:p>
         </w:tc>
@@ -2912,6 +3591,90 @@
         </w:trPr>
         <w:tc>
           <w:tcPr>
+            <w:tcW w:type="dxa" w:w="650"/>
+            <w:tcMar>
+              <w:top w:type="dxa" w:w="40"/>
+              <w:left w:type="dxa" w:w="80"/>
+              <w:bottom w:type="dxa" w:w="40"/>
+              <w:right w:type="dxa" w:w="80"/>
+            </w:tcMar>
+            <w:vAlign w:val="center"/>
+          </w:tcPr>
+          <w:p>
+            <w:pPr>
+              <w:spacing w:after="30" w:before="30" w:line="240" w:lineRule="auto"/>
+              <w:jc w:val="center"/>
+            </w:pPr>
+            <w:r>
+              <w:rPr>
+                <w:rFonts w:ascii="Arial" w:cs="Arial" w:eastAsia="Arial" w:hAnsi="Arial"/>
+                <w:b w:val="false"/>
+                <w:bCs w:val="false"/>
+                <w:sz w:val="20"/>
+                <w:szCs w:val="20"/>
+              </w:rPr>
+              <w:t xml:space="preserve">1</w:t>
+            </w:r>
+          </w:p>
+        </w:tc>
+        <w:tc>
+          <w:tcPr>
+            <w:tcW w:type="dxa" w:w="650"/>
+            <w:tcMar>
+              <w:top w:type="dxa" w:w="40"/>
+              <w:left w:type="dxa" w:w="80"/>
+              <w:bottom w:type="dxa" w:w="40"/>
+              <w:right w:type="dxa" w:w="80"/>
+            </w:tcMar>
+            <w:vAlign w:val="center"/>
+          </w:tcPr>
+          <w:p>
+            <w:pPr>
+              <w:spacing w:after="30" w:before="30" w:line="240" w:lineRule="auto"/>
+              <w:jc w:val="center"/>
+            </w:pPr>
+            <w:r>
+              <w:rPr>
+                <w:rFonts w:ascii="Arial" w:cs="Arial" w:eastAsia="Arial" w:hAnsi="Arial"/>
+                <w:b w:val="false"/>
+                <w:bCs w:val="false"/>
+                <w:sz w:val="20"/>
+                <w:szCs w:val="20"/>
+              </w:rPr>
+              <w:t xml:space="preserve">1</w:t>
+            </w:r>
+          </w:p>
+        </w:tc>
+        <w:tc>
+          <w:tcPr>
+            <w:tcW w:type="dxa" w:w="650"/>
+            <w:tcMar>
+              <w:top w:type="dxa" w:w="40"/>
+              <w:left w:type="dxa" w:w="80"/>
+              <w:bottom w:type="dxa" w:w="40"/>
+              <w:right w:type="dxa" w:w="80"/>
+            </w:tcMar>
+            <w:vAlign w:val="center"/>
+          </w:tcPr>
+          <w:p>
+            <w:pPr>
+              <w:spacing w:after="30" w:before="30" w:line="240" w:lineRule="auto"/>
+              <w:jc w:val="center"/>
+            </w:pPr>
+            <w:r>
+              <w:rPr>
+                <w:rFonts w:ascii="Arial" w:cs="Arial" w:eastAsia="Arial" w:hAnsi="Arial"/>
+                <w:b w:val="false"/>
+                <w:bCs w:val="false"/>
+                <w:sz w:val="20"/>
+                <w:szCs w:val="20"/>
+              </w:rPr>
+              <w:t xml:space="preserve">1</w:t>
+            </w:r>
+          </w:p>
+        </w:tc>
+        <w:tc>
+          <w:tcPr>
             <w:tcW w:type="dxa" w:w="700"/>
             <w:tcMar>
               <w:top w:type="dxa" w:w="40"/>
@@ -2934,69 +3697,98 @@
                 <w:sz w:val="20"/>
                 <w:szCs w:val="20"/>
               </w:rPr>
+              <w:t xml:space="preserve">0</w:t>
+            </w:r>
+          </w:p>
+        </w:tc>
+        <w:tc>
+          <w:tcPr>
+            <w:tcW w:type="dxa" w:w="700"/>
+            <w:tcMar>
+              <w:top w:type="dxa" w:w="40"/>
+              <w:left w:type="dxa" w:w="80"/>
+              <w:bottom w:type="dxa" w:w="40"/>
+              <w:right w:type="dxa" w:w="80"/>
+            </w:tcMar>
+            <w:vAlign w:val="center"/>
+          </w:tcPr>
+          <w:p>
+            <w:pPr>
+              <w:spacing w:after="30" w:before="30" w:line="240" w:lineRule="auto"/>
+              <w:jc w:val="center"/>
+            </w:pPr>
+            <w:r>
+              <w:rPr>
+                <w:rFonts w:ascii="Arial" w:cs="Arial" w:eastAsia="Arial" w:hAnsi="Arial"/>
+                <w:b w:val="false"/>
+                <w:bCs w:val="false"/>
+                <w:sz w:val="20"/>
+                <w:szCs w:val="20"/>
+              </w:rPr>
+              <w:t xml:space="preserve">0</w:t>
+            </w:r>
+          </w:p>
+        </w:tc>
+        <w:tc>
+          <w:tcPr>
+            <w:tcW w:type="dxa" w:w="1500"/>
+            <w:tcMar>
+              <w:top w:type="dxa" w:w="40"/>
+              <w:left w:type="dxa" w:w="80"/>
+              <w:bottom w:type="dxa" w:w="40"/>
+              <w:right w:type="dxa" w:w="80"/>
+            </w:tcMar>
+            <w:vAlign w:val="center"/>
+          </w:tcPr>
+          <w:p>
+            <w:pPr>
+              <w:spacing w:after="30" w:before="30" w:line="240" w:lineRule="auto"/>
+              <w:jc w:val="center"/>
+            </w:pPr>
+            <w:r>
+              <w:rPr>
+                <w:rFonts w:ascii="Arial" w:cs="Arial" w:eastAsia="Arial" w:hAnsi="Arial"/>
+                <w:b w:val="false"/>
+                <w:bCs w:val="false"/>
+                <w:sz w:val="20"/>
+                <w:szCs w:val="20"/>
+              </w:rPr>
+              <w:t xml:space="preserve">0</w:t>
+            </w:r>
+          </w:p>
+        </w:tc>
+        <w:tc>
+          <w:tcPr>
+            <w:tcW w:type="dxa" w:w="1300"/>
+            <w:shd w:fill="E2EFDA" w:val="clear"/>
+            <w:tcMar>
+              <w:top w:type="dxa" w:w="40"/>
+              <w:left w:type="dxa" w:w="80"/>
+              <w:bottom w:type="dxa" w:w="40"/>
+              <w:right w:type="dxa" w:w="80"/>
+            </w:tcMar>
+            <w:vAlign w:val="center"/>
+          </w:tcPr>
+          <w:p>
+            <w:pPr>
+              <w:spacing w:after="30" w:before="30" w:line="240" w:lineRule="auto"/>
+              <w:jc w:val="center"/>
+            </w:pPr>
+            <w:r>
+              <w:rPr>
+                <w:rFonts w:ascii="Arial" w:cs="Arial" w:eastAsia="Arial" w:hAnsi="Arial"/>
+                <w:b w:val="false"/>
+                <w:bCs w:val="false"/>
+                <w:sz w:val="20"/>
+                <w:szCs w:val="20"/>
+              </w:rPr>
               <w:t xml:space="preserve">1</w:t>
             </w:r>
           </w:p>
         </w:tc>
         <w:tc>
           <w:tcPr>
-            <w:tcW w:type="dxa" w:w="700"/>
-            <w:tcMar>
-              <w:top w:type="dxa" w:w="40"/>
-              <w:left w:type="dxa" w:w="80"/>
-              <w:bottom w:type="dxa" w:w="40"/>
-              <w:right w:type="dxa" w:w="80"/>
-            </w:tcMar>
-            <w:vAlign w:val="center"/>
-          </w:tcPr>
-          <w:p>
-            <w:pPr>
-              <w:spacing w:after="30" w:before="30" w:line="240" w:lineRule="auto"/>
-              <w:jc w:val="center"/>
-            </w:pPr>
-            <w:r>
-              <w:rPr>
-                <w:rFonts w:ascii="Arial" w:cs="Arial" w:eastAsia="Arial" w:hAnsi="Arial"/>
-                <w:b w:val="false"/>
-                <w:bCs w:val="false"/>
-                <w:sz w:val="20"/>
-                <w:szCs w:val="20"/>
-              </w:rPr>
-              <w:t xml:space="preserve">1</w:t>
-            </w:r>
-          </w:p>
-        </w:tc>
-        <w:tc>
-          <w:tcPr>
-            <w:tcW w:type="dxa" w:w="700"/>
-            <w:tcMar>
-              <w:top w:type="dxa" w:w="40"/>
-              <w:left w:type="dxa" w:w="80"/>
-              <w:bottom w:type="dxa" w:w="40"/>
-              <w:right w:type="dxa" w:w="80"/>
-            </w:tcMar>
-            <w:vAlign w:val="center"/>
-          </w:tcPr>
-          <w:p>
-            <w:pPr>
-              <w:spacing w:after="30" w:before="30" w:line="240" w:lineRule="auto"/>
-              <w:jc w:val="center"/>
-            </w:pPr>
-            <w:r>
-              <w:rPr>
-                <w:rFonts w:ascii="Arial" w:cs="Arial" w:eastAsia="Arial" w:hAnsi="Arial"/>
-                <w:b w:val="false"/>
-                <w:bCs w:val="false"/>
-                <w:sz w:val="20"/>
-                <w:szCs w:val="20"/>
-              </w:rPr>
-              <w:t xml:space="preserve">1</w:t>
-            </w:r>
-          </w:p>
-        </w:tc>
-        <w:tc>
-          <w:tcPr>
-            <w:tcW w:type="dxa" w:w="700"/>
+            <w:tcW w:type="dxa" w:w="750"/>
             <w:shd w:fill="E2EFDA" w:val="clear"/>
             <w:tcMar>
               <w:top w:type="dxa" w:w="40"/>
@@ -3023,41 +3815,13 @@
             </w:r>
           </w:p>
         </w:tc>
-        <w:tc>
-          <w:tcPr>
-            <w:tcW w:type="dxa" w:w="3900"/>
-            <w:tcMar>
-              <w:top w:type="dxa" w:w="40"/>
-              <w:left w:type="dxa" w:w="80"/>
-              <w:bottom w:type="dxa" w:w="40"/>
-              <w:right w:type="dxa" w:w="80"/>
-            </w:tcMar>
-            <w:vAlign w:val="center"/>
-          </w:tcPr>
-          <w:p>
-            <w:pPr>
-              <w:spacing w:after="30" w:before="30" w:line="240" w:lineRule="auto"/>
-              <w:jc w:val="left"/>
-            </w:pPr>
-            <w:r>
-              <w:rPr>
-                <w:rFonts w:ascii="Arial" w:cs="Arial" w:eastAsia="Arial" w:hAnsi="Arial"/>
-                <w:b w:val="false"/>
-                <w:bCs w:val="false"/>
-                <w:sz w:val="20"/>
-                <w:szCs w:val="20"/>
-              </w:rPr>
-              <w:t xml:space="preserve">Condición 2: A, B y C pulsados</w:t>
-            </w:r>
-          </w:p>
-        </w:tc>
       </w:tr>
     </w:tbl>
     <w:p>
       <w:pPr>
         <w:pStyle w:val="Heading1"/>
         <w:keepNext/>
-        <w:spacing w:after="120" w:before="240"/>
+        <w:spacing w:after="120" w:before="180"/>
       </w:pPr>
       <w:r>
         <w:rPr>
@@ -3082,7 +3846,7 @@
           <w:sz w:val="24"/>
           <w:szCs w:val="24"/>
         </w:rPr>
-        <w:t xml:space="preserve">La función booleana se obtiene de la tabla de verdad mediante la suma de productos (SOP): se toma un minitérmino por cada renglón donde S = 1. Los renglones activos son el m₁ (A = 0, B = 0, C = 1) y el m₇ (A = 1, B = 1, C = 1), por lo que la función canónica es:</w:t>
+        <w:t xml:space="preserve">La función booleana se obtiene de la tabla de verdad mediante la suma de productos (SOP): se toma un minitérmino por cada renglón donde X = 1. Los renglones activos son el m₁ (A = 0, B = 0, C = 1) y el m₇ (A = 1, B = 1, C = 1), por lo que la función canónica es:</w:t>
       </w:r>
     </w:p>
     <w:p>
@@ -3098,7 +3862,7 @@
           <w:sz w:val="24"/>
           <w:szCs w:val="24"/>
         </w:rPr>
-        <w:t xml:space="preserve">S = A′ · B′ · C + A · B · C</w:t>
+        <w:t xml:space="preserve">X = A′ · B′ · C + A · B · C</w:t>
       </w:r>
     </w:p>
     <w:p>
@@ -3128,7 +3892,7 @@
           <w:sz w:val="24"/>
           <w:szCs w:val="24"/>
         </w:rPr>
-        <w:t xml:space="preserve">S = C · (A′ · B′ + A · B)</w:t>
+        <w:t xml:space="preserve">X = C · (A′ · B′ + A · B)</w:t>
       </w:r>
     </w:p>
     <w:p>
@@ -3142,7 +3906,7 @@
           <w:sz w:val="24"/>
           <w:szCs w:val="24"/>
         </w:rPr>
-        <w:t xml:space="preserve">La expresión entre paréntesis es exactamente la definición de la compuerta XNOR (equivalencia): vale 1 cuando A y B son iguales. Por lo tanto, la función mínima queda:</w:t>
+        <w:t xml:space="preserve">La expresión entre paréntesis es exactamente la definición de la compuerta XNOR (equivalencia): vale 1 cuando A y B son iguales. El símbolo ⊙ de la XNOR se tomó de la bibliografía de sistemas digitales de las referencias y equivale a escribir (A ⊕ B)′, la negación de la XOR. Por lo tanto, la función mínima queda:</w:t>
       </w:r>
     </w:p>
     <w:p>
@@ -3158,7 +3922,7 @@
           <w:sz w:val="24"/>
           <w:szCs w:val="24"/>
         </w:rPr>
-        <w:t xml:space="preserve">S = C · (A ⊙ B) = C · (A ⊕ B)′</w:t>
+        <w:t xml:space="preserve">X = C · (A ⊙ B) = C · (A ⊕ B)′</w:t>
       </w:r>
     </w:p>
     <w:p>
@@ -3189,7 +3953,7 @@
           <w:sz w:val="20"/>
           <w:szCs w:val="20"/>
         </w:rPr>
-        <w:t xml:space="preserve">Tabla 3. Mapa de Karnaugh de la función S(A, B, C).</w:t>
+        <w:t xml:space="preserve">Tabla 3. Mapa de Karnaugh de la función X(A, B, C).</w:t>
       </w:r>
     </w:p>
     <w:tbl>
@@ -3640,7 +4404,7 @@
       <w:pPr>
         <w:pStyle w:val="Heading1"/>
         <w:keepNext/>
-        <w:spacing w:after="120" w:before="240"/>
+        <w:spacing w:after="120" w:before="180"/>
       </w:pPr>
       <w:r>
         <w:rPr>
@@ -3665,7 +4429,7 @@
           <w:sz w:val="24"/>
           <w:szCs w:val="24"/>
         </w:rPr>
-        <w:t xml:space="preserve">La Figura 1 muestra el circuito que implementa directamente la función canónica: los inversores generan A′ y B′, la compuerta AND 1 detecta la condición 1 (A′·B′·C), la AND 2 detecta la condición 2 (A·B·C) y la OR final activa la salida S cuando ocurre cualquiera de las dos.</w:t>
+        <w:t xml:space="preserve">La Figura 1 muestra el circuito que implementa directamente la función canónica: los inversores generan A′ y B′, la compuerta AND 1 detecta la condición 1 (A′·B′·C), la AND 2 detecta la condición 2 (A·B·C) y la OR final activa la salida X cuando ocurre cualquiera de las dos.</w:t>
       </w:r>
     </w:p>
     <w:p>
@@ -3677,7 +4441,7 @@
       <w:r>
         <w:drawing>
           <wp:inline distT="0" distB="0" distL="0" distR="0">
-            <wp:extent cx="3810000" cy="1771650"/>
+            <wp:extent cx="3619500" cy="1685925"/>
             <wp:effectExtent t="0" r="0" b="0" l="0"/>
             <wp:docPr id="1" name="" descr="" title=""/>
             <wp:cNvGraphicFramePr>
@@ -3702,7 +4466,7 @@
                   <pic:spPr bwMode="auto">
                     <a:xfrm>
                       <a:off x="0" y="0"/>
-                      <a:ext cx="3810000" cy="1771650"/>
+                      <a:ext cx="3619500" cy="1685925"/>
                     </a:xfrm>
                     <a:prstGeom prst="rect">
                       <a:avLst/>
@@ -3717,7 +4481,7 @@
     </w:p>
     <w:p>
       <w:pPr>
-        <w:spacing w:after="180" w:before="60"/>
+        <w:spacing w:after="140" w:before="60"/>
         <w:jc w:val="center"/>
       </w:pPr>
       <w:r>
@@ -3728,7 +4492,7 @@
           <w:sz w:val="20"/>
           <w:szCs w:val="20"/>
         </w:rPr>
-        <w:t xml:space="preserve">Figura 1. Circuito lógico de la función canónica S = A′·B′·C + A·B·C.</w:t>
+        <w:t xml:space="preserve">Figura 1. Circuito lógico de la función canónica X = A′·B′·C + A·B·C.</w:t>
       </w:r>
     </w:p>
     <w:p>
@@ -3742,7 +4506,7 @@
           <w:sz w:val="24"/>
           <w:szCs w:val="24"/>
         </w:rPr>
-        <w:t xml:space="preserve">La Figura 2 presenta el circuito de la función simplificada: la compuerta XNOR compara los botones A y B y entrega 1 cuando coinciden; la compuerta AND combina ese resultado con C, de manera que la puerta solo se abre si, además de la coincidencia entre A y B, el botón C está pulsado. Este es el circuito propuesto como solución, por requerir menos componentes.</w:t>
+        <w:t xml:space="preserve">La Figura 2 presenta el circuito de la función simplificada: la XNOR compara los botones A y B y entrega 1 cuando coinciden, y la AND combina ese resultado con C. Así, la puerta solo se abre si A y B coinciden y además C está pulsado. Este es el circuito propuesto como solución, por requerir menos componentes.</w:t>
       </w:r>
     </w:p>
     <w:p>
@@ -3754,7 +4518,7 @@
       <w:r>
         <w:drawing>
           <wp:inline distT="0" distB="0" distL="0" distR="0">
-            <wp:extent cx="3143250" cy="1066800"/>
+            <wp:extent cx="2857500" cy="971550"/>
             <wp:effectExtent t="0" r="0" b="0" l="0"/>
             <wp:docPr id="1" name="" descr="" title=""/>
             <wp:cNvGraphicFramePr>
@@ -3779,7 +4543,7 @@
                   <pic:spPr bwMode="auto">
                     <a:xfrm>
                       <a:off x="0" y="0"/>
-                      <a:ext cx="3143250" cy="1066800"/>
+                      <a:ext cx="2857500" cy="971550"/>
                     </a:xfrm>
                     <a:prstGeom prst="rect">
                       <a:avLst/>
@@ -3794,7 +4558,7 @@
     </w:p>
     <w:p>
       <w:pPr>
-        <w:spacing w:after="180" w:before="60"/>
+        <w:spacing w:after="140" w:before="60"/>
         <w:jc w:val="center"/>
       </w:pPr>
       <w:r>
@@ -3805,14 +4569,14 @@
           <w:sz w:val="20"/>
           <w:szCs w:val="20"/>
         </w:rPr>
-        <w:t xml:space="preserve">Figura 2. Circuito simplificado S = C · (A ⊙ B).</w:t>
+        <w:t xml:space="preserve">Figura 2. Circuito simplificado X = C · (A ⊙ B).</w:t>
       </w:r>
     </w:p>
     <w:p>
       <w:pPr>
         <w:pStyle w:val="Heading1"/>
         <w:keepNext/>
-        <w:spacing w:after="120" w:before="240"/>
+        <w:spacing w:after="120" w:before="180"/>
       </w:pPr>
       <w:r>
         <w:rPr>
@@ -3885,7 +4649,7 @@
           <w:sz w:val="16"/>
           <w:szCs w:val="16"/>
         </w:rPr>
-        <w:t xml:space="preserve">% Apertura (S=1): 1) C pulsado, A y B en reposo   2) A, B y C pulsados</w:t>
+        <w:t xml:space="preserve">% Apertura (X=1): 1) C pulsado, A y B en reposo   2) A, B y C pulsados</w:t>
       </w:r>
     </w:p>
     <w:p>
@@ -3901,7 +4665,7 @@
           <w:sz w:val="16"/>
           <w:szCs w:val="16"/>
         </w:rPr>
-        <w:t xml:space="preserve">% Funcion canonica: S = A'·B'·C + A·B·C   Simplificada: S = C·(A XNOR B)</w:t>
+        <w:t xml:space="preserve">% Funcion canonica: X = A'·B'·C + A·B·C   Simplificada: X = C·(A XNOR B)</w:t>
       </w:r>
     </w:p>
     <w:p>
@@ -4013,7 +4777,7 @@
           <w:sz w:val="16"/>
           <w:szCs w:val="16"/>
         </w:rPr>
-        <w:t xml:space="preserve"/>
+        <w:t xml:space="preserve">% Terminos de las dos condiciones de apertura</w:t>
       </w:r>
     </w:p>
     <w:p>
@@ -4029,7 +4793,7 @@
           <w:sz w:val="16"/>
           <w:szCs w:val="16"/>
         </w:rPr>
-        <w:t xml:space="preserve">% Evaluacion de ambas expresiones booleanas</w:t>
+        <w:t xml:space="preserve">Cond1 = ~A &amp; ~B &amp; C;    % condicion 1: C pulsado, A y B en reposo</w:t>
       </w:r>
     </w:p>
     <w:p>
@@ -4045,7 +4809,7 @@
           <w:sz w:val="16"/>
           <w:szCs w:val="16"/>
         </w:rPr>
-        <w:t xml:space="preserve">S_canonica     = (~A &amp; ~B &amp; C) | (A &amp; B &amp; C);</w:t>
+        <w:t xml:space="preserve">Cond2 = A &amp; B &amp; C;      % condicion 2: A, B y C pulsados</w:t>
       </w:r>
     </w:p>
     <w:p>
@@ -4061,7 +4825,7 @@
           <w:sz w:val="16"/>
           <w:szCs w:val="16"/>
         </w:rPr>
-        <w:t xml:space="preserve">S_simplificada = C &amp; ~xor(A, B);</w:t>
+        <w:t xml:space="preserve">% Salida canonica (suma de los terminos) y salida simplificada</w:t>
       </w:r>
     </w:p>
     <w:p>
@@ -4077,7 +4841,7 @@
           <w:sz w:val="16"/>
           <w:szCs w:val="16"/>
         </w:rPr>
-        <w:t xml:space="preserve"/>
+        <w:t xml:space="preserve">X              = Cond1 | Cond2;</w:t>
       </w:r>
     </w:p>
     <w:p>
@@ -4093,7 +4857,7 @@
           <w:sz w:val="16"/>
           <w:szCs w:val="16"/>
         </w:rPr>
-        <w:t xml:space="preserve">% Tabla de verdad completa</w:t>
+        <w:t xml:space="preserve">X_simplificada = C &amp; ~xor(A, B);</w:t>
       </w:r>
     </w:p>
     <w:p>
@@ -4109,7 +4873,7 @@
           <w:sz w:val="16"/>
           <w:szCs w:val="16"/>
         </w:rPr>
-        <w:t xml:space="preserve">T = table(A, B, C, double(S_canonica), double(S_simplificada), ...</w:t>
+        <w:t xml:space="preserve">% Tabla de verdad completa con las columnas de la funcion</w:t>
       </w:r>
     </w:p>
     <w:p>
@@ -4125,7 +4889,7 @@
           <w:sz w:val="16"/>
           <w:szCs w:val="16"/>
         </w:rPr>
-        <w:t xml:space="preserve">    'VariableNames', {'A', 'B', 'C', 'S_canonica', 'S_simplificada'});</w:t>
+        <w:t xml:space="preserve">T = table(A, B, C, double(Cond1), double(Cond2), double(X), ...</w:t>
       </w:r>
     </w:p>
     <w:p>
@@ -4141,7 +4905,7 @@
           <w:sz w:val="16"/>
           <w:szCs w:val="16"/>
         </w:rPr>
-        <w:t xml:space="preserve">disp(T)</w:t>
+        <w:t xml:space="preserve">    double(X_simplificada), 'VariableNames', ...</w:t>
       </w:r>
     </w:p>
     <w:p>
@@ -4157,7 +4921,7 @@
           <w:sz w:val="16"/>
           <w:szCs w:val="16"/>
         </w:rPr>
-        <w:t xml:space="preserve"/>
+        <w:t xml:space="preserve">    {'A', 'B', 'C', 'Cond1', 'Cond2', 'X', 'X_simplificada'});</w:t>
       </w:r>
     </w:p>
     <w:p>
@@ -4173,7 +4937,7 @@
           <w:sz w:val="16"/>
           <w:szCs w:val="16"/>
         </w:rPr>
-        <w:t xml:space="preserve">% Verificacion de equivalencia entre ambas expresiones</w:t>
+        <w:t xml:space="preserve">disp(T)</w:t>
       </w:r>
     </w:p>
     <w:p>
@@ -4189,7 +4953,7 @@
           <w:sz w:val="16"/>
           <w:szCs w:val="16"/>
         </w:rPr>
-        <w:t xml:space="preserve">if isequal(S_canonica, S_simplificada)</w:t>
+        <w:t xml:space="preserve"/>
       </w:r>
     </w:p>
     <w:p>
@@ -4205,7 +4969,7 @@
           <w:sz w:val="16"/>
           <w:szCs w:val="16"/>
         </w:rPr>
-        <w:t xml:space="preserve">    disp('Ambas expresiones son equivalentes: el diseno del circuito es correcto.')</w:t>
+        <w:t xml:space="preserve">% Verificacion de equivalencia entre ambas expresiones</w:t>
       </w:r>
     </w:p>
     <w:p>
@@ -4221,7 +4985,7 @@
           <w:sz w:val="16"/>
           <w:szCs w:val="16"/>
         </w:rPr>
-        <w:t xml:space="preserve">else</w:t>
+        <w:t xml:space="preserve">if isequal(X, X_simplificada)</w:t>
       </w:r>
     </w:p>
     <w:p>
@@ -4237,7 +5001,7 @@
           <w:sz w:val="16"/>
           <w:szCs w:val="16"/>
         </w:rPr>
-        <w:t xml:space="preserve">    disp('Las expresiones NO coinciden: es necesario revisar el diseno.')</w:t>
+        <w:t xml:space="preserve">    disp('Ambas expresiones son equivalentes: el diseno del circuito es correcto.')</w:t>
       </w:r>
     </w:p>
     <w:p>
@@ -4253,12 +5017,44 @@
           <w:sz w:val="16"/>
           <w:szCs w:val="16"/>
         </w:rPr>
+        <w:t xml:space="preserve">else</w:t>
+      </w:r>
+    </w:p>
+    <w:p>
+      <w:pPr>
+        <w:keepNext w:val="25"/>
+        <w:keepLines w:val="25"/>
+        <w:shd w:fill="F2F2F2" w:val="clear"/>
+        <w:spacing w:after="0" w:line="240" w:lineRule="auto"/>
+      </w:pPr>
+      <w:r>
+        <w:rPr>
+          <w:rFonts w:ascii="Consolas" w:cs="Consolas" w:eastAsia="Consolas" w:hAnsi="Consolas"/>
+          <w:sz w:val="16"/>
+          <w:szCs w:val="16"/>
+        </w:rPr>
+        <w:t xml:space="preserve">    disp('Las expresiones NO coinciden: es necesario revisar el diseno.')</w:t>
+      </w:r>
+    </w:p>
+    <w:p>
+      <w:pPr>
+        <w:keepNext w:val="26"/>
+        <w:keepLines w:val="26"/>
+        <w:shd w:fill="F2F2F2" w:val="clear"/>
+        <w:spacing w:after="0" w:line="240" w:lineRule="auto"/>
+      </w:pPr>
+      <w:r>
+        <w:rPr>
+          <w:rFonts w:ascii="Consolas" w:cs="Consolas" w:eastAsia="Consolas" w:hAnsi="Consolas"/>
+          <w:sz w:val="16"/>
+          <w:szCs w:val="16"/>
+        </w:rPr>
         <w:t xml:space="preserve">end</w:t>
       </w:r>
     </w:p>
     <w:p>
       <w:pPr>
-        <w:spacing w:after="180" w:before="60"/>
+        <w:spacing w:after="140" w:before="60"/>
         <w:jc w:val="center"/>
       </w:pPr>
       <w:r>
@@ -4300,7 +5096,7 @@
           <w:sz w:val="16"/>
           <w:szCs w:val="16"/>
         </w:rPr>
-        <w:t xml:space="preserve">    A    B    C    S_canonica    S_simplificada</w:t>
+        <w:t xml:space="preserve">    A    B    C    Cond1    Cond2    X    X_simplificada</w:t>
       </w:r>
     </w:p>
     <w:p>
@@ -4316,7 +5112,7 @@
           <w:sz w:val="16"/>
           <w:szCs w:val="16"/>
         </w:rPr>
-        <w:t xml:space="preserve">    _    _    _    __________    ______________</w:t>
+        <w:t xml:space="preserve">    _    _    _    _____    _____    _    ______________</w:t>
       </w:r>
     </w:p>
     <w:p>
@@ -4348,7 +5144,7 @@
           <w:sz w:val="16"/>
           <w:szCs w:val="16"/>
         </w:rPr>
-        <w:t xml:space="preserve">    0    0    0        0               0       </w:t>
+        <w:t xml:space="preserve">    0    0    0      0        0     0           0       </w:t>
       </w:r>
     </w:p>
     <w:p>
@@ -4364,7 +5160,7 @@
           <w:sz w:val="16"/>
           <w:szCs w:val="16"/>
         </w:rPr>
-        <w:t xml:space="preserve">    0    0    1        1               1       </w:t>
+        <w:t xml:space="preserve">    0    0    1      1        0     1           1       </w:t>
       </w:r>
     </w:p>
     <w:p>
@@ -4380,7 +5176,7 @@
           <w:sz w:val="16"/>
           <w:szCs w:val="16"/>
         </w:rPr>
-        <w:t xml:space="preserve">    0    1    0        0               0       </w:t>
+        <w:t xml:space="preserve">    0    1    0      0        0     0           0       </w:t>
       </w:r>
     </w:p>
     <w:p>
@@ -4396,7 +5192,7 @@
           <w:sz w:val="16"/>
           <w:szCs w:val="16"/>
         </w:rPr>
-        <w:t xml:space="preserve">    0    1    1        0               0       </w:t>
+        <w:t xml:space="preserve">    0    1    1      0        0     0           0       </w:t>
       </w:r>
     </w:p>
     <w:p>
@@ -4412,7 +5208,7 @@
           <w:sz w:val="16"/>
           <w:szCs w:val="16"/>
         </w:rPr>
-        <w:t xml:space="preserve">    1    0    0        0               0       </w:t>
+        <w:t xml:space="preserve">    1    0    0      0        0     0           0       </w:t>
       </w:r>
     </w:p>
     <w:p>
@@ -4428,7 +5224,7 @@
           <w:sz w:val="16"/>
           <w:szCs w:val="16"/>
         </w:rPr>
-        <w:t xml:space="preserve">    1    0    1        0               0       </w:t>
+        <w:t xml:space="preserve">    1    0    1      0        0     0           0       </w:t>
       </w:r>
     </w:p>
     <w:p>
@@ -4444,7 +5240,7 @@
           <w:sz w:val="16"/>
           <w:szCs w:val="16"/>
         </w:rPr>
-        <w:t xml:space="preserve">    1    1    0        0               0       </w:t>
+        <w:t xml:space="preserve">    1    1    0      0        0     0           0       </w:t>
       </w:r>
     </w:p>
     <w:p>
@@ -4460,7 +5256,7 @@
           <w:sz w:val="16"/>
           <w:szCs w:val="16"/>
         </w:rPr>
-        <w:t xml:space="preserve">    1    1    1        1               1       </w:t>
+        <w:t xml:space="preserve">    1    1    1      0        1     1           1       </w:t>
       </w:r>
     </w:p>
     <w:p>
@@ -4497,7 +5293,7 @@
     </w:p>
     <w:p>
       <w:pPr>
-        <w:spacing w:after="180" w:before="60"/>
+        <w:spacing w:after="140" w:before="60"/>
         <w:jc w:val="center"/>
       </w:pPr>
       <w:r>
@@ -4522,14 +5318,14 @@
           <w:sz w:val="24"/>
           <w:szCs w:val="24"/>
         </w:rPr>
-        <w:t xml:space="preserve">La tabla generada por MATLAB coincide renglón por renglón con la Tabla 2, y el mensaje final confirma que la función canónica y la simplificada son equivalentes.</w:t>
+        <w:t xml:space="preserve">La tabla de MATLAB coincide con la Tabla 2 (Cond1 y Cond2 son los términos A′·B′·C y A·B·C) y el mensaje final confirma que ambas funciones son equivalentes.</w:t>
       </w:r>
     </w:p>
     <w:p>
       <w:pPr>
         <w:pStyle w:val="Heading1"/>
         <w:keepNext/>
-        <w:spacing w:after="120" w:before="240"/>
+        <w:spacing w:after="120" w:before="180"/>
       </w:pPr>
       <w:r>
         <w:rPr>
@@ -4582,14 +5378,14 @@
           <w:sz w:val="24"/>
           <w:szCs w:val="24"/>
         </w:rPr>
-        <w:t xml:space="preserve">Se concluye que el álgebra de Boole y las compuertas lógicas permiten convertir paso a paso un requerimiento escrito, como las condiciones de apertura de una puerta, en un circuito digital que funciona y usa el menor número de componentes. Partir de la tabla de verdad garantiza que el diseño cumpla las especificaciones, la simplificación reduce el circuito y la comprobación con software valida el resultado antes de armar el circuito físico.</w:t>
+        <w:t xml:space="preserve">Se concluye que el álgebra de Boole y las compuertas lógicas permiten convertir paso a paso un requerimiento escrito, como las condiciones de apertura de una puerta, en un circuito digital que funciona con el menor número de componentes. La tabla de verdad garantiza que el diseño cumpla las especificaciones, la simplificación reduce el circuito y la comprobación con software valida el resultado antes de armarlo físicamente.</w:t>
       </w:r>
     </w:p>
     <w:p>
       <w:pPr>
         <w:pStyle w:val="Heading1"/>
         <w:keepNext/>
-        <w:spacing w:after="120" w:before="240"/>
+        <w:spacing w:after="120" w:before="180"/>
       </w:pPr>
       <w:r>
         <w:rPr>

</xml_diff>

<commit_message>
Incrustar el escudo en las carátulas y agregar carátula de la Actividad 4
El escudo de la universidad, recortado de la carátula de la tarea
anterior, queda incrustado en la carátula del reporte de compuertas
lógicas y en una nueva carátula para la actividad de Java (con la
materia y el profesor pendientes de llenar).

Co-Authored-By: Claude Fable 5 <noreply@anthropic.com>
Claude-Session: https://claude.ai/code/session_015UF77vNc2anNhC4cbLjXz9
</commit_message>
<xml_diff>
--- a/tarea-4-compuertas-logicas/Tarea4_Circuitos_con_compuertas_logicas.docx
+++ b/tarea-4-compuertas-logicas/Tarea4_Circuitos_con_compuertas_logicas.docx
@@ -4,7 +4,53 @@
   <w:body>
     <w:p>
       <w:pPr>
-        <w:spacing w:after="700" w:before="2600"/>
+        <w:spacing w:after="100" w:before="1200"/>
+        <w:jc w:val="center"/>
+      </w:pPr>
+      <w:r>
+        <w:drawing>
+          <wp:inline distT="0" distB="0" distL="0" distR="0">
+            <wp:extent cx="1428750" cy="1371600"/>
+            <wp:effectExtent t="0" r="0" b="0" l="0"/>
+            <wp:docPr id="1" name="" descr="" title=""/>
+            <wp:cNvGraphicFramePr>
+              <a:graphicFrameLocks xmlns:a="http://schemas.openxmlformats.org/drawingml/2006/main" noChangeAspect="1"/>
+            </wp:cNvGraphicFramePr>
+            <a:graphic xmlns:a="http://schemas.openxmlformats.org/drawingml/2006/main">
+              <a:graphicData uri="http://schemas.openxmlformats.org/drawingml/2006/picture">
+                <pic:pic xmlns:pic="http://schemas.openxmlformats.org/drawingml/2006/picture">
+                  <pic:nvPicPr>
+                    <pic:cNvPr id="0" name="" descr=""/>
+                    <pic:cNvPicPr>
+                      <a:picLocks noChangeAspect="1" noChangeArrowheads="1"/>
+                    </pic:cNvPicPr>
+                  </pic:nvPicPr>
+                  <pic:blipFill>
+                    <a:blip r:embed="rId9" cstate="none"/>
+                    <a:srcRect/>
+                    <a:stretch>
+                      <a:fillRect/>
+                    </a:stretch>
+                  </pic:blipFill>
+                  <pic:spPr bwMode="auto">
+                    <a:xfrm>
+                      <a:off x="0" y="0"/>
+                      <a:ext cx="1428750" cy="1371600"/>
+                    </a:xfrm>
+                    <a:prstGeom prst="rect">
+                      <a:avLst/>
+                    </a:prstGeom>
+                  </pic:spPr>
+                </pic:pic>
+              </a:graphicData>
+            </a:graphic>
+          </wp:inline>
+        </w:drawing>
+      </w:r>
+    </w:p>
+    <w:p>
+      <w:pPr>
+        <w:spacing w:after="700" w:before="0"/>
         <w:jc w:val="center"/>
       </w:pPr>
       <w:r>
@@ -525,7 +571,7 @@
                           </pic:cNvPicPr>
                         </pic:nvPicPr>
                         <pic:blipFill>
-                          <a:blip r:embed="rId9" cstate="none"/>
+                          <a:blip r:embed="rId10" cstate="none"/>
                           <a:srcRect/>
                           <a:stretch>
                             <a:fillRect/>
@@ -679,175 +725,6 @@
               <w:drawing>
                 <wp:inline distT="0" distB="0" distL="0" distR="0">
                   <wp:extent cx="762000" cy="457200"/>
-                  <wp:effectExtent t="0" r="0" b="0" l="0"/>
-                  <wp:docPr id="1" name="" descr="" title=""/>
-                  <wp:cNvGraphicFramePr>
-                    <a:graphicFrameLocks xmlns:a="http://schemas.openxmlformats.org/drawingml/2006/main" noChangeAspect="1"/>
-                  </wp:cNvGraphicFramePr>
-                  <a:graphic xmlns:a="http://schemas.openxmlformats.org/drawingml/2006/main">
-                    <a:graphicData uri="http://schemas.openxmlformats.org/drawingml/2006/picture">
-                      <pic:pic xmlns:pic="http://schemas.openxmlformats.org/drawingml/2006/picture">
-                        <pic:nvPicPr>
-                          <pic:cNvPr id="0" name="" descr=""/>
-                          <pic:cNvPicPr>
-                            <a:picLocks noChangeAspect="1" noChangeArrowheads="1"/>
-                          </pic:cNvPicPr>
-                        </pic:nvPicPr>
-                        <pic:blipFill>
-                          <a:blip r:embed="rId10" cstate="none"/>
-                          <a:srcRect/>
-                          <a:stretch>
-                            <a:fillRect/>
-                          </a:stretch>
-                        </pic:blipFill>
-                        <pic:spPr bwMode="auto">
-                          <a:xfrm>
-                            <a:off x="0" y="0"/>
-                            <a:ext cx="762000" cy="457200"/>
-                          </a:xfrm>
-                          <a:prstGeom prst="rect">
-                            <a:avLst/>
-                          </a:prstGeom>
-                        </pic:spPr>
-                      </pic:pic>
-                    </a:graphicData>
-                  </a:graphic>
-                </wp:inline>
-              </w:drawing>
-            </w:r>
-          </w:p>
-        </w:tc>
-        <w:tc>
-          <w:tcPr>
-            <w:tcW w:type="dxa" w:w="1650"/>
-            <w:tcMar>
-              <w:top w:type="dxa" w:w="40"/>
-              <w:left w:type="dxa" w:w="80"/>
-              <w:bottom w:type="dxa" w:w="40"/>
-              <w:right w:type="dxa" w:w="80"/>
-            </w:tcMar>
-            <w:vAlign w:val="center"/>
-          </w:tcPr>
-          <w:p>
-            <w:pPr>
-              <w:spacing w:after="30" w:before="30" w:line="240" w:lineRule="auto"/>
-              <w:jc w:val="center"/>
-            </w:pPr>
-            <w:r>
-              <w:rPr>
-                <w:rFonts w:ascii="Arial" w:cs="Arial" w:eastAsia="Arial" w:hAnsi="Arial"/>
-                <w:sz w:val="20"/>
-                <w:szCs w:val="20"/>
-              </w:rPr>
-              <w:t xml:space="preserve">X = A · B</w:t>
-            </w:r>
-          </w:p>
-        </w:tc>
-        <w:tc>
-          <w:tcPr>
-            <w:tcW w:type="dxa" w:w="2750"/>
-            <w:tcMar>
-              <w:top w:type="dxa" w:w="40"/>
-              <w:left w:type="dxa" w:w="80"/>
-              <w:bottom w:type="dxa" w:w="40"/>
-              <w:right w:type="dxa" w:w="80"/>
-            </w:tcMar>
-            <w:vAlign w:val="center"/>
-          </w:tcPr>
-          <w:p>
-            <w:pPr>
-              <w:spacing w:after="30" w:before="30" w:line="240" w:lineRule="auto"/>
-              <w:jc w:val="left"/>
-            </w:pPr>
-            <w:r>
-              <w:rPr>
-                <w:rFonts w:ascii="Arial" w:cs="Arial" w:eastAsia="Arial" w:hAnsi="Arial"/>
-                <w:sz w:val="20"/>
-                <w:szCs w:val="20"/>
-              </w:rPr>
-              <w:t xml:space="preserve">Producto lógico. La salida es 1 solo cuando todas sus entradas valen 1; basta un 0 para que la salida sea 0.</w:t>
-            </w:r>
-          </w:p>
-        </w:tc>
-        <w:tc>
-          <w:tcPr>
-            <w:tcW w:type="dxa" w:w="2200"/>
-            <w:tcMar>
-              <w:top w:type="dxa" w:w="40"/>
-              <w:left w:type="dxa" w:w="80"/>
-              <w:bottom w:type="dxa" w:w="40"/>
-              <w:right w:type="dxa" w:w="80"/>
-            </w:tcMar>
-            <w:vAlign w:val="center"/>
-          </w:tcPr>
-          <w:p>
-            <w:pPr>
-              <w:spacing w:after="30" w:before="30" w:line="240" w:lineRule="auto"/>
-              <w:jc w:val="left"/>
-            </w:pPr>
-            <w:r>
-              <w:rPr>
-                <w:rFonts w:ascii="Arial" w:cs="Arial" w:eastAsia="Arial" w:hAnsi="Arial"/>
-                <w:sz w:val="20"/>
-                <w:szCs w:val="20"/>
-              </w:rPr>
-              <w:t xml:space="preserve">Prensa de mando bimanual: la máquina solo opera si el operador pulsa los dos botones al mismo tiempo.</w:t>
-            </w:r>
-          </w:p>
-        </w:tc>
-      </w:tr>
-      <w:tr>
-        <w:trPr>
-          <w:cantSplit/>
-        </w:trPr>
-        <w:tc>
-          <w:tcPr>
-            <w:tcW w:type="dxa" w:w="1250"/>
-            <w:tcMar>
-              <w:top w:type="dxa" w:w="40"/>
-              <w:left w:type="dxa" w:w="80"/>
-              <w:bottom w:type="dxa" w:w="40"/>
-              <w:right w:type="dxa" w:w="80"/>
-            </w:tcMar>
-            <w:vAlign w:val="center"/>
-          </w:tcPr>
-          <w:p>
-            <w:pPr>
-              <w:spacing w:after="30" w:before="30" w:line="240" w:lineRule="auto"/>
-              <w:jc w:val="center"/>
-            </w:pPr>
-            <w:r>
-              <w:rPr>
-                <w:rFonts w:ascii="Arial" w:cs="Arial" w:eastAsia="Arial" w:hAnsi="Arial"/>
-                <w:b/>
-                <w:bCs/>
-                <w:sz w:val="20"/>
-                <w:szCs w:val="20"/>
-              </w:rPr>
-              <w:t xml:space="preserve">OR</w:t>
-            </w:r>
-          </w:p>
-        </w:tc>
-        <w:tc>
-          <w:tcPr>
-            <w:tcW w:type="dxa" w:w="1550"/>
-            <w:tcMar>
-              <w:top w:type="dxa" w:w="40"/>
-              <w:left w:type="dxa" w:w="80"/>
-              <w:bottom w:type="dxa" w:w="40"/>
-              <w:right w:type="dxa" w:w="80"/>
-            </w:tcMar>
-            <w:vAlign w:val="center"/>
-          </w:tcPr>
-          <w:p>
-            <w:pPr>
-              <w:spacing w:after="30" w:before="30"/>
-              <w:jc w:val="center"/>
-            </w:pPr>
-            <w:r>
-              <w:drawing>
-                <wp:inline distT="0" distB="0" distL="0" distR="0">
-                  <wp:extent cx="762000" cy="438150"/>
                   <wp:effectExtent t="0" r="0" b="0" l="0"/>
                   <wp:docPr id="1" name="" descr="" title=""/>
                   <wp:cNvGraphicFramePr>
@@ -872,7 +749,7 @@
                         <pic:spPr bwMode="auto">
                           <a:xfrm>
                             <a:off x="0" y="0"/>
-                            <a:ext cx="762000" cy="438150"/>
+                            <a:ext cx="762000" cy="457200"/>
                           </a:xfrm>
                           <a:prstGeom prst="rect">
                             <a:avLst/>
@@ -908,7 +785,7 @@
                 <w:sz w:val="20"/>
                 <w:szCs w:val="20"/>
               </w:rPr>
-              <w:t xml:space="preserve">X = A + B</w:t>
+              <w:t xml:space="preserve">X = A · B</w:t>
             </w:r>
           </w:p>
         </w:tc>
@@ -934,7 +811,7 @@
                 <w:sz w:val="20"/>
                 <w:szCs w:val="20"/>
               </w:rPr>
-              <w:t xml:space="preserve">Suma lógica. La salida es 1 cuando al menos una de sus entradas vale 1; solo es 0 si todas las entradas son 0.</w:t>
+              <w:t xml:space="preserve">Producto lógico. La salida es 1 solo cuando todas sus entradas valen 1; basta un 0 para que la salida sea 0.</w:t>
             </w:r>
           </w:p>
         </w:tc>
@@ -960,7 +837,7 @@
                 <w:sz w:val="20"/>
                 <w:szCs w:val="20"/>
               </w:rPr>
-              <w:t xml:space="preserve">Timbre con botón en la puerta principal y en la trasera: suena al pulsar cualquiera de los dos.</w:t>
+              <w:t xml:space="preserve">Prensa de mando bimanual: la máquina solo opera si el operador pulsa los dos botones al mismo tiempo.</w:t>
             </w:r>
           </w:p>
         </w:tc>
@@ -993,7 +870,7 @@
                 <w:sz w:val="20"/>
                 <w:szCs w:val="20"/>
               </w:rPr>
-              <w:t xml:space="preserve">NAND</w:t>
+              <w:t xml:space="preserve">OR</w:t>
             </w:r>
           </w:p>
         </w:tc>
@@ -1016,7 +893,7 @@
             <w:r>
               <w:drawing>
                 <wp:inline distT="0" distB="0" distL="0" distR="0">
-                  <wp:extent cx="762000" cy="457200"/>
+                  <wp:extent cx="762000" cy="438150"/>
                   <wp:effectExtent t="0" r="0" b="0" l="0"/>
                   <wp:docPr id="1" name="" descr="" title=""/>
                   <wp:cNvGraphicFramePr>
@@ -1041,7 +918,7 @@
                         <pic:spPr bwMode="auto">
                           <a:xfrm>
                             <a:off x="0" y="0"/>
-                            <a:ext cx="762000" cy="457200"/>
+                            <a:ext cx="762000" cy="438150"/>
                           </a:xfrm>
                           <a:prstGeom prst="rect">
                             <a:avLst/>
@@ -1077,7 +954,7 @@
                 <w:sz w:val="20"/>
                 <w:szCs w:val="20"/>
               </w:rPr>
-              <w:t xml:space="preserve">X = (A · B)′</w:t>
+              <w:t xml:space="preserve">X = A + B</w:t>
             </w:r>
           </w:p>
         </w:tc>
@@ -1103,7 +980,7 @@
                 <w:sz w:val="20"/>
                 <w:szCs w:val="20"/>
               </w:rPr>
-              <w:t xml:space="preserve">AND negada. La salida es 0 únicamente cuando todas las entradas valen 1; en cualquier otro caso es 1.</w:t>
+              <w:t xml:space="preserve">Suma lógica. La salida es 1 cuando al menos una de sus entradas vale 1; solo es 0 si todas las entradas son 0.</w:t>
             </w:r>
           </w:p>
         </w:tc>
@@ -1129,7 +1006,7 @@
                 <w:sz w:val="20"/>
                 <w:szCs w:val="20"/>
               </w:rPr>
-              <w:t xml:space="preserve">Alarma de seguridad que se desactiva solo cuando los dos interruptores de protección están cerrados.</w:t>
+              <w:t xml:space="preserve">Timbre con botón en la puerta principal y en la trasera: suena al pulsar cualquiera de los dos.</w:t>
             </w:r>
           </w:p>
         </w:tc>
@@ -1162,7 +1039,7 @@
                 <w:sz w:val="20"/>
                 <w:szCs w:val="20"/>
               </w:rPr>
-              <w:t xml:space="preserve">NOR</w:t>
+              <w:t xml:space="preserve">NAND</w:t>
             </w:r>
           </w:p>
         </w:tc>
@@ -1185,7 +1062,7 @@
             <w:r>
               <w:drawing>
                 <wp:inline distT="0" distB="0" distL="0" distR="0">
-                  <wp:extent cx="762000" cy="438150"/>
+                  <wp:extent cx="762000" cy="457200"/>
                   <wp:effectExtent t="0" r="0" b="0" l="0"/>
                   <wp:docPr id="1" name="" descr="" title=""/>
                   <wp:cNvGraphicFramePr>
@@ -1210,7 +1087,7 @@
                         <pic:spPr bwMode="auto">
                           <a:xfrm>
                             <a:off x="0" y="0"/>
-                            <a:ext cx="762000" cy="438150"/>
+                            <a:ext cx="762000" cy="457200"/>
                           </a:xfrm>
                           <a:prstGeom prst="rect">
                             <a:avLst/>
@@ -1246,7 +1123,7 @@
                 <w:sz w:val="20"/>
                 <w:szCs w:val="20"/>
               </w:rPr>
-              <w:t xml:space="preserve">X = (A + B)′</w:t>
+              <w:t xml:space="preserve">X = (A · B)′</w:t>
             </w:r>
           </w:p>
         </w:tc>
@@ -1272,7 +1149,7 @@
                 <w:sz w:val="20"/>
                 <w:szCs w:val="20"/>
               </w:rPr>
-              <w:t xml:space="preserve">OR negada. La salida es 1 únicamente cuando todas las entradas valen 0.</w:t>
+              <w:t xml:space="preserve">AND negada. La salida es 0 únicamente cuando todas las entradas valen 1; en cualquier otro caso es 1.</w:t>
             </w:r>
           </w:p>
         </w:tc>
@@ -1298,7 +1175,7 @@
                 <w:sz w:val="20"/>
                 <w:szCs w:val="20"/>
               </w:rPr>
-              <w:t xml:space="preserve">Indicador de “sistema en reposo”: se enciende solo cuando ningún motor está en marcha.</w:t>
+              <w:t xml:space="preserve">Alarma de seguridad que se desactiva solo cuando los dos interruptores de protección están cerrados.</w:t>
             </w:r>
           </w:p>
         </w:tc>
@@ -1331,7 +1208,7 @@
                 <w:sz w:val="20"/>
                 <w:szCs w:val="20"/>
               </w:rPr>
-              <w:t xml:space="preserve">XOR</w:t>
+              <w:t xml:space="preserve">NOR</w:t>
             </w:r>
           </w:p>
         </w:tc>
@@ -1415,7 +1292,7 @@
                 <w:sz w:val="20"/>
                 <w:szCs w:val="20"/>
               </w:rPr>
-              <w:t xml:space="preserve">X = A ⊕ B</w:t>
+              <w:t xml:space="preserve">X = (A + B)′</w:t>
             </w:r>
           </w:p>
         </w:tc>
@@ -1441,7 +1318,7 @@
                 <w:sz w:val="20"/>
                 <w:szCs w:val="20"/>
               </w:rPr>
-              <w:t xml:space="preserve">OR exclusiva. La salida es 1 cuando sus entradas tienen valores diferentes, y 0 cuando son iguales.</w:t>
+              <w:t xml:space="preserve">OR negada. La salida es 1 únicamente cuando todas las entradas valen 0.</w:t>
             </w:r>
           </w:p>
         </w:tc>
@@ -1467,7 +1344,7 @@
                 <w:sz w:val="20"/>
                 <w:szCs w:val="20"/>
               </w:rPr>
-              <w:t xml:space="preserve">Luz de escalera con dos apagadores: cambia de estado al accionar cualquiera de ellos.</w:t>
+              <w:t xml:space="preserve">Indicador de “sistema en reposo”: se enciende solo cuando ningún motor está en marcha.</w:t>
             </w:r>
           </w:p>
         </w:tc>
@@ -1500,7 +1377,7 @@
                 <w:sz w:val="20"/>
                 <w:szCs w:val="20"/>
               </w:rPr>
-              <w:t xml:space="preserve">XNOR</w:t>
+              <w:t xml:space="preserve">XOR</w:t>
             </w:r>
           </w:p>
         </w:tc>
@@ -1584,6 +1461,175 @@
                 <w:sz w:val="20"/>
                 <w:szCs w:val="20"/>
               </w:rPr>
+              <w:t xml:space="preserve">X = A ⊕ B</w:t>
+            </w:r>
+          </w:p>
+        </w:tc>
+        <w:tc>
+          <w:tcPr>
+            <w:tcW w:type="dxa" w:w="2750"/>
+            <w:tcMar>
+              <w:top w:type="dxa" w:w="40"/>
+              <w:left w:type="dxa" w:w="80"/>
+              <w:bottom w:type="dxa" w:w="40"/>
+              <w:right w:type="dxa" w:w="80"/>
+            </w:tcMar>
+            <w:vAlign w:val="center"/>
+          </w:tcPr>
+          <w:p>
+            <w:pPr>
+              <w:spacing w:after="30" w:before="30" w:line="240" w:lineRule="auto"/>
+              <w:jc w:val="left"/>
+            </w:pPr>
+            <w:r>
+              <w:rPr>
+                <w:rFonts w:ascii="Arial" w:cs="Arial" w:eastAsia="Arial" w:hAnsi="Arial"/>
+                <w:sz w:val="20"/>
+                <w:szCs w:val="20"/>
+              </w:rPr>
+              <w:t xml:space="preserve">OR exclusiva. La salida es 1 cuando sus entradas tienen valores diferentes, y 0 cuando son iguales.</w:t>
+            </w:r>
+          </w:p>
+        </w:tc>
+        <w:tc>
+          <w:tcPr>
+            <w:tcW w:type="dxa" w:w="2200"/>
+            <w:tcMar>
+              <w:top w:type="dxa" w:w="40"/>
+              <w:left w:type="dxa" w:w="80"/>
+              <w:bottom w:type="dxa" w:w="40"/>
+              <w:right w:type="dxa" w:w="80"/>
+            </w:tcMar>
+            <w:vAlign w:val="center"/>
+          </w:tcPr>
+          <w:p>
+            <w:pPr>
+              <w:spacing w:after="30" w:before="30" w:line="240" w:lineRule="auto"/>
+              <w:jc w:val="left"/>
+            </w:pPr>
+            <w:r>
+              <w:rPr>
+                <w:rFonts w:ascii="Arial" w:cs="Arial" w:eastAsia="Arial" w:hAnsi="Arial"/>
+                <w:sz w:val="20"/>
+                <w:szCs w:val="20"/>
+              </w:rPr>
+              <w:t xml:space="preserve">Luz de escalera con dos apagadores: cambia de estado al accionar cualquiera de ellos.</w:t>
+            </w:r>
+          </w:p>
+        </w:tc>
+      </w:tr>
+      <w:tr>
+        <w:trPr>
+          <w:cantSplit/>
+        </w:trPr>
+        <w:tc>
+          <w:tcPr>
+            <w:tcW w:type="dxa" w:w="1250"/>
+            <w:tcMar>
+              <w:top w:type="dxa" w:w="40"/>
+              <w:left w:type="dxa" w:w="80"/>
+              <w:bottom w:type="dxa" w:w="40"/>
+              <w:right w:type="dxa" w:w="80"/>
+            </w:tcMar>
+            <w:vAlign w:val="center"/>
+          </w:tcPr>
+          <w:p>
+            <w:pPr>
+              <w:spacing w:after="30" w:before="30" w:line="240" w:lineRule="auto"/>
+              <w:jc w:val="center"/>
+            </w:pPr>
+            <w:r>
+              <w:rPr>
+                <w:rFonts w:ascii="Arial" w:cs="Arial" w:eastAsia="Arial" w:hAnsi="Arial"/>
+                <w:b/>
+                <w:bCs/>
+                <w:sz w:val="20"/>
+                <w:szCs w:val="20"/>
+              </w:rPr>
+              <w:t xml:space="preserve">XNOR</w:t>
+            </w:r>
+          </w:p>
+        </w:tc>
+        <w:tc>
+          <w:tcPr>
+            <w:tcW w:type="dxa" w:w="1550"/>
+            <w:tcMar>
+              <w:top w:type="dxa" w:w="40"/>
+              <w:left w:type="dxa" w:w="80"/>
+              <w:bottom w:type="dxa" w:w="40"/>
+              <w:right w:type="dxa" w:w="80"/>
+            </w:tcMar>
+            <w:vAlign w:val="center"/>
+          </w:tcPr>
+          <w:p>
+            <w:pPr>
+              <w:spacing w:after="30" w:before="30"/>
+              <w:jc w:val="center"/>
+            </w:pPr>
+            <w:r>
+              <w:drawing>
+                <wp:inline distT="0" distB="0" distL="0" distR="0">
+                  <wp:extent cx="762000" cy="438150"/>
+                  <wp:effectExtent t="0" r="0" b="0" l="0"/>
+                  <wp:docPr id="1" name="" descr="" title=""/>
+                  <wp:cNvGraphicFramePr>
+                    <a:graphicFrameLocks xmlns:a="http://schemas.openxmlformats.org/drawingml/2006/main" noChangeAspect="1"/>
+                  </wp:cNvGraphicFramePr>
+                  <a:graphic xmlns:a="http://schemas.openxmlformats.org/drawingml/2006/main">
+                    <a:graphicData uri="http://schemas.openxmlformats.org/drawingml/2006/picture">
+                      <pic:pic xmlns:pic="http://schemas.openxmlformats.org/drawingml/2006/picture">
+                        <pic:nvPicPr>
+                          <pic:cNvPr id="0" name="" descr=""/>
+                          <pic:cNvPicPr>
+                            <a:picLocks noChangeAspect="1" noChangeArrowheads="1"/>
+                          </pic:cNvPicPr>
+                        </pic:nvPicPr>
+                        <pic:blipFill>
+                          <a:blip r:embed="rId16" cstate="none"/>
+                          <a:srcRect/>
+                          <a:stretch>
+                            <a:fillRect/>
+                          </a:stretch>
+                        </pic:blipFill>
+                        <pic:spPr bwMode="auto">
+                          <a:xfrm>
+                            <a:off x="0" y="0"/>
+                            <a:ext cx="762000" cy="438150"/>
+                          </a:xfrm>
+                          <a:prstGeom prst="rect">
+                            <a:avLst/>
+                          </a:prstGeom>
+                        </pic:spPr>
+                      </pic:pic>
+                    </a:graphicData>
+                  </a:graphic>
+                </wp:inline>
+              </w:drawing>
+            </w:r>
+          </w:p>
+        </w:tc>
+        <w:tc>
+          <w:tcPr>
+            <w:tcW w:type="dxa" w:w="1650"/>
+            <w:tcMar>
+              <w:top w:type="dxa" w:w="40"/>
+              <w:left w:type="dxa" w:w="80"/>
+              <w:bottom w:type="dxa" w:w="40"/>
+              <w:right w:type="dxa" w:w="80"/>
+            </w:tcMar>
+            <w:vAlign w:val="center"/>
+          </w:tcPr>
+          <w:p>
+            <w:pPr>
+              <w:spacing w:after="30" w:before="30" w:line="240" w:lineRule="auto"/>
+              <w:jc w:val="center"/>
+            </w:pPr>
+            <w:r>
+              <w:rPr>
+                <w:rFonts w:ascii="Arial" w:cs="Arial" w:eastAsia="Arial" w:hAnsi="Arial"/>
+                <w:sz w:val="20"/>
+                <w:szCs w:val="20"/>
+              </w:rPr>
               <w:t xml:space="preserve">X = (A ⊕ B)′ = A ⊙ B</w:t>
             </w:r>
           </w:p>
@@ -4457,7 +4503,7 @@
                     </pic:cNvPicPr>
                   </pic:nvPicPr>
                   <pic:blipFill>
-                    <a:blip r:embed="rId16" cstate="none"/>
+                    <a:blip r:embed="rId17" cstate="none"/>
                     <a:srcRect/>
                     <a:stretch>
                       <a:fillRect/>
@@ -4534,7 +4580,7 @@
                     </pic:cNvPicPr>
                   </pic:nvPicPr>
                   <pic:blipFill>
-                    <a:blip r:embed="rId17" cstate="none"/>
+                    <a:blip r:embed="rId18" cstate="none"/>
                     <a:srcRect/>
                     <a:stretch>
                       <a:fillRect/>

</xml_diff>